<commit_message>
Add production support/incident management (ServiceNow) experience
Adds ServiceNow incident tracking, business liaison on dev/QA queries,
and Claude-built incident dashboards under the Allianz role, plus a
ServiceNow competency entry, to both the resume and site content.

Co-Authored-By: Claude Sonnet 5 <noreply@anthropic.com>
</commit_message>
<xml_diff>
--- a/public/Anuraj_K_B_Resume.docx
+++ b/public/Anuraj_K_B_Resume.docx
@@ -1093,6 +1093,98 @@
           </w:p>
         </w:tc>
       </w:tr>
+      <w:tr>
+        <w:tblPrEx>
+          <w:tblBorders>
+            <w:top w:val="none" w:color="FFFFFF" w:sz="0" w:space="0"/>
+            <w:left w:val="none" w:color="FFFFFF" w:sz="0" w:space="0"/>
+            <w:bottom w:val="none" w:color="FFFFFF" w:sz="0" w:space="0"/>
+            <w:right w:val="none" w:color="FFFFFF" w:sz="0" w:space="0"/>
+            <w:insideH w:val="single" w:color="auto" w:sz="4" w:space="0"/>
+            <w:insideV w:val="single" w:color="auto" w:sz="4" w:space="0"/>
+          </w:tblBorders>
+          <w:tblCellMar>
+            <w:top w:w="0" w:type="dxa"/>
+            <w:left w:w="10" w:type="dxa"/>
+            <w:bottom w:w="0" w:type="dxa"/>
+            <w:right w:w="10" w:type="dxa"/>
+          </w:tblCellMar>
+        </w:tblPrEx>
+        <w:tc>
+          <w:tcPr>
+            <w:tcW w:w="5089" w:type="dxa"/>
+            <w:tcBorders>
+              <w:top w:val="nil"/>
+              <w:left w:val="nil"/>
+              <w:bottom w:val="nil"/>
+              <w:right w:val="nil"/>
+            </w:tcBorders>
+            <w:tcMar>
+              <w:top w:w="20" w:type="dxa"/>
+              <w:left w:w="0" w:type="dxa"/>
+              <w:bottom w:w="20" w:type="dxa"/>
+              <w:right w:w="140" w:type="dxa"/>
+            </w:tcMar>
+            <w:vAlign w:val="top"/>
+          </w:tcPr>
+          <w:p>
+            <w:pPr>
+              <w:pStyle w:val="16"/>
+              <w:numPr>
+                <w:ilvl w:val="0"/>
+                <w:numId w:val="1"/>
+              </w:numPr>
+              <w:spacing w:after="60"/>
+            </w:pPr>
+            <w:r>
+              <w:rPr>
+                <w:rFonts w:ascii="Arial" w:hAnsi="Arial" w:eastAsia="Arial" w:cs="Arial"/>
+                <w:color w:val="232323"/>
+                <w:sz w:val="20"/>
+                <w:szCs w:val="20"/>
+              </w:rPr>
+              <w:t>Production Support &amp; Incident Management (ServiceNow)</w:t>
+            </w:r>
+          </w:p>
+        </w:tc>
+        <w:tc>
+          <w:tcPr>
+            <w:tcW w:w="5089" w:type="dxa"/>
+            <w:tcBorders>
+              <w:top w:val="nil"/>
+              <w:left w:val="nil"/>
+              <w:bottom w:val="nil"/>
+              <w:right w:val="nil"/>
+            </w:tcBorders>
+            <w:tcMar>
+              <w:top w:w="20" w:type="dxa"/>
+              <w:left w:w="0" w:type="dxa"/>
+              <w:bottom w:w="20" w:type="dxa"/>
+              <w:right w:w="140" w:type="dxa"/>
+            </w:tcMar>
+            <w:vAlign w:val="top"/>
+          </w:tcPr>
+          <w:p>
+            <w:pPr>
+              <w:pStyle w:val="16"/>
+              <w:numPr>
+                <w:ilvl w:val="0"/>
+                <w:numId w:val="1"/>
+              </w:numPr>
+              <w:spacing w:after="60"/>
+            </w:pPr>
+            <w:r>
+              <w:rPr>
+                <w:rFonts w:ascii="Arial" w:hAnsi="Arial" w:eastAsia="Arial" w:cs="Arial"/>
+                <w:color w:val="232323"/>
+                <w:sz w:val="20"/>
+                <w:szCs w:val="20"/>
+              </w:rPr>
+              <w:t>ServiceNow Dashboard Design &amp; Reporting</w:t>
+            </w:r>
+          </w:p>
+        </w:tc>
+      </w:tr>
     </w:tbl>
     <w:p>
       <w:pPr>
@@ -1528,14 +1620,6 @@
           <w:szCs w:val="18"/>
         </w:rPr>
         <w:tab/>
-      </w:r>
-      <w:r>
-        <w:rPr>
-          <w:rFonts w:ascii="Arial" w:hAnsi="Arial" w:eastAsia="Arial" w:cs="Arial"/>
-          <w:color w:val="6B7280"/>
-          <w:sz w:val="18"/>
-          <w:szCs w:val="18"/>
-        </w:rPr>
         <w:t>Apr 2024 – Present</w:t>
       </w:r>
     </w:p>
@@ -1781,59 +1865,6 @@
     </w:p>
     <w:p>
       <w:pPr>
-        <w:spacing w:before="140" w:after="20"/>
-      </w:pPr>
-      <w:r>
-        <w:rPr>
-          <w:rFonts w:ascii="Arial" w:hAnsi="Arial" w:eastAsia="Arial" w:cs="Arial"/>
-          <w:b/>
-          <w:bCs/>
-          <w:color w:val="232323"/>
-          <w:sz w:val="22"/>
-          <w:szCs w:val="22"/>
-        </w:rPr>
-        <w:t>Indium Software</w:t>
-      </w:r>
-    </w:p>
-    <w:p>
-      <w:pPr>
-        <w:tabs>
-          <w:tab w:val="right" w:pos="10178"/>
-        </w:tabs>
-        <w:spacing w:after="80"/>
-      </w:pPr>
-      <w:r>
-        <w:rPr>
-          <w:rFonts w:ascii="Arial" w:hAnsi="Arial" w:eastAsia="Arial" w:cs="Arial"/>
-          <w:i/>
-          <w:iCs/>
-          <w:color w:val="1F4E79"/>
-          <w:sz w:val="21"/>
-          <w:szCs w:val="21"/>
-        </w:rPr>
-        <w:t>Project Manager / Scrum Master</w:t>
-      </w:r>
-      <w:r>
-        <w:rPr>
-          <w:rFonts w:ascii="Arial" w:hAnsi="Arial" w:eastAsia="Arial" w:cs="Arial"/>
-          <w:color w:val="6B7280"/>
-          <w:sz w:val="18"/>
-          <w:szCs w:val="18"/>
-        </w:rPr>
-        <w:tab/>
-      </w:r>
-      <w:r>
-        <w:rPr>
-          <w:rFonts w:ascii="Arial" w:hAnsi="Arial" w:eastAsia="Arial" w:cs="Arial"/>
-          <w:color w:val="6B7280"/>
-          <w:sz w:val="18"/>
-          <w:szCs w:val="18"/>
-        </w:rPr>
-        <w:t>Dec 2022 – Nov 2023</w:t>
-      </w:r>
-    </w:p>
-    <w:p>
-      <w:pPr>
         <w:pStyle w:val="16"/>
         <w:numPr>
           <w:ilvl w:val="0"/>
@@ -1849,7 +1880,7 @@
           <w:sz w:val="20"/>
           <w:szCs w:val="20"/>
         </w:rPr>
-        <w:t>Served as Project Manager / Scrum Master, facilitating Agile ceremonies and managing end-to-end delivery for cross-functional product teams.</w:t>
+        <w:t>Lead the team handling production support, ensuring incidents are logged and tracked in ServiceNow, and liaising with business stakeholders to resolve developer and QA queries on open incidents.</w:t>
       </w:r>
     </w:p>
     <w:p>
@@ -1869,7 +1900,52 @@
           <w:sz w:val="20"/>
           <w:szCs w:val="20"/>
         </w:rPr>
-        <w:t>Tracked velocity, cycle time, and lead time against quality and performance criteria; coached teams to higher levels of Scrum maturity at a sustainable, comfortable pace.</w:t>
+        <w:t>Built ServiceNow incident dashboards — including one developed using Claude — to give leadership real-time visibility into incident volume, status, and trends.</w:t>
+      </w:r>
+    </w:p>
+    <w:p>
+      <w:pPr>
+        <w:spacing w:before="140" w:after="20"/>
+      </w:pPr>
+      <w:r>
+        <w:rPr>
+          <w:rFonts w:ascii="Arial" w:hAnsi="Arial" w:eastAsia="Arial" w:cs="Arial"/>
+          <w:b/>
+          <w:bCs/>
+          <w:color w:val="232323"/>
+          <w:sz w:val="22"/>
+          <w:szCs w:val="22"/>
+        </w:rPr>
+        <w:t>Indium Software</w:t>
+      </w:r>
+    </w:p>
+    <w:p>
+      <w:pPr>
+        <w:tabs>
+          <w:tab w:val="right" w:pos="10178"/>
+        </w:tabs>
+        <w:spacing w:after="80"/>
+      </w:pPr>
+      <w:r>
+        <w:rPr>
+          <w:rFonts w:ascii="Arial" w:hAnsi="Arial" w:eastAsia="Arial" w:cs="Arial"/>
+          <w:i/>
+          <w:iCs/>
+          <w:color w:val="1F4E79"/>
+          <w:sz w:val="21"/>
+          <w:szCs w:val="21"/>
+        </w:rPr>
+        <w:t>Project Manager / Scrum Master</w:t>
+      </w:r>
+      <w:r>
+        <w:rPr>
+          <w:rFonts w:ascii="Arial" w:hAnsi="Arial" w:eastAsia="Arial" w:cs="Arial"/>
+          <w:color w:val="6B7280"/>
+          <w:sz w:val="18"/>
+          <w:szCs w:val="18"/>
+        </w:rPr>
+        <w:tab/>
+        <w:t>Dec 2022 – Nov 2023</w:t>
       </w:r>
     </w:p>
     <w:p>
@@ -1889,7 +1965,7 @@
           <w:sz w:val="20"/>
           <w:szCs w:val="20"/>
         </w:rPr>
-        <w:t>Managed risk, issue, and dependency logs; partnered with Product Owners to refine and prioritise the backlog.</w:t>
+        <w:t>Served as Project Manager / Scrum Master, facilitating Agile ceremonies and managing end-to-end delivery for cross-functional product teams.</w:t>
       </w:r>
     </w:p>
     <w:p>
@@ -1909,6 +1985,46 @@
           <w:sz w:val="20"/>
           <w:szCs w:val="20"/>
         </w:rPr>
+        <w:t>Tracked velocity, cycle time, and lead time against quality and performance criteria; coached teams to higher levels of Scrum maturity at a sustainable, comfortable pace.</w:t>
+      </w:r>
+    </w:p>
+    <w:p>
+      <w:pPr>
+        <w:pStyle w:val="16"/>
+        <w:numPr>
+          <w:ilvl w:val="0"/>
+          <w:numId w:val="1"/>
+        </w:numPr>
+        <w:spacing w:after="40" w:line="250" w:lineRule="auto"/>
+        <w:jc w:val="both"/>
+      </w:pPr>
+      <w:r>
+        <w:rPr>
+          <w:rFonts w:ascii="Arial" w:hAnsi="Arial" w:eastAsia="Arial" w:cs="Arial"/>
+          <w:color w:val="232323"/>
+          <w:sz w:val="20"/>
+          <w:szCs w:val="20"/>
+        </w:rPr>
+        <w:t>Managed risk, issue, and dependency logs; partnered with Product Owners to refine and prioritise the backlog.</w:t>
+      </w:r>
+    </w:p>
+    <w:p>
+      <w:pPr>
+        <w:pStyle w:val="16"/>
+        <w:numPr>
+          <w:ilvl w:val="0"/>
+          <w:numId w:val="1"/>
+        </w:numPr>
+        <w:spacing w:after="40" w:line="250" w:lineRule="auto"/>
+        <w:jc w:val="both"/>
+      </w:pPr>
+      <w:r>
+        <w:rPr>
+          <w:rFonts w:ascii="Arial" w:hAnsi="Arial" w:eastAsia="Arial" w:cs="Arial"/>
+          <w:color w:val="232323"/>
+          <w:sz w:val="20"/>
+          <w:szCs w:val="20"/>
+        </w:rPr>
         <w:t>Drove stakeholder communication, status reporting, and process improvement initiatives, improving sprint delivery predictability by ~15%.</w:t>
       </w:r>
     </w:p>
@@ -1955,14 +2071,6 @@
           <w:szCs w:val="18"/>
         </w:rPr>
         <w:tab/>
-      </w:r>
-      <w:r>
-        <w:rPr>
-          <w:rFonts w:ascii="Arial" w:hAnsi="Arial" w:eastAsia="Arial" w:cs="Arial"/>
-          <w:color w:val="6B7280"/>
-          <w:sz w:val="18"/>
-          <w:szCs w:val="18"/>
-        </w:rPr>
         <w:t>Sep 2019 – May 2022</w:t>
       </w:r>
     </w:p>
@@ -2100,14 +2208,6 @@
           <w:szCs w:val="18"/>
         </w:rPr>
         <w:tab/>
-      </w:r>
-      <w:r>
-        <w:rPr>
-          <w:rFonts w:ascii="Arial" w:hAnsi="Arial" w:eastAsia="Arial" w:cs="Arial"/>
-          <w:color w:val="6B7280"/>
-          <w:sz w:val="18"/>
-          <w:szCs w:val="18"/>
-        </w:rPr>
         <w:t>Jan 2018 – Sep 2019</w:t>
       </w:r>
     </w:p>

</xml_diff>

<commit_message>
Sync site content with ATS-tailored resume updates
Updates hero/about copy, Allianz experience highlights, and skill
groups to match the resume's reworded summary and Core Competencies
table (ceremony facilitation, risk/escalation management, cross-
functional collaboration, Agile metrics, governance, and enterprise
Agile adoption).

Co-Authored-By: Claude Sonnet 5 <noreply@anthropic.com>
</commit_message>
<xml_diff>
--- a/public/Anuraj_K_B_Resume.docx
+++ b/public/Anuraj_K_B_Resume.docx
@@ -32,7 +32,7 @@
           <w:sz w:val="23"/>
           <w:szCs w:val="23"/>
         </w:rPr>
-        <w:t>Agile Delivery Lead | Senior Scrum Master | Agile Coach (PMP, CSM)</w:t>
+        <w:t xml:space="preserve"> Senior Scrum Master |  (PMP, CSM)</w:t>
       </w:r>
     </w:p>
     <w:p>
@@ -46,7 +46,26 @@
           <w:sz w:val="18"/>
           <w:szCs w:val="18"/>
         </w:rPr>
-        <w:t>India, Kerala   •   Open to Relocation – Dubai, UAE   •   +91 96455 53445   •   anurajkbabu@gmail.com</w:t>
+        <w:t>India, Kerala   •    +91 96455 53445   •   anurajkb</w:t>
+      </w:r>
+      <w:r>
+        <w:rPr>
+          <w:rFonts w:hint="default" w:ascii="Arial" w:hAnsi="Arial" w:eastAsia="Arial" w:cs="Arial"/>
+          <w:color w:val="6B7280"/>
+          <w:sz w:val="18"/>
+          <w:szCs w:val="18"/>
+          <w:lang w:val="en-US"/>
+        </w:rPr>
+        <w:t>62</w:t>
+      </w:r>
+      <w:r>
+        <w:rPr>
+          <w:rFonts w:ascii="Arial" w:hAnsi="Arial" w:eastAsia="Arial" w:cs="Arial"/>
+          <w:color w:val="6B7280"/>
+          <w:sz w:val="18"/>
+          <w:szCs w:val="18"/>
+        </w:rPr>
+        <w:t>@gmail.com</w:t>
       </w:r>
     </w:p>
     <w:p>
@@ -81,7 +100,7 @@
           <w:sz w:val="20"/>
           <w:szCs w:val="20"/>
         </w:rPr>
-        <w:t>Agile Delivery Lead and Senior Scrum Master with 16+ years of IT program and project delivery experience, including 8+ years driving Agile/Scrum-based delivery and 4+ years in dedicated Scrum Master / Agile Delivery Lead roles. PMP and CSM certified, with a consistent track record of leading end-to-end delivery — spanning vendor-led initiatives, in-house product enhancements, and support releases — across matrixed, multi-team, and globally distributed environments — partnering with Western European and global business stakeholders — including financial services digital transformation programs.</w:t>
+        <w:t>Agile Delivery Lead and Senior Scrum Master with 16+ years of IT project delivery experience, including 8+ years driving Agile/Scrum-based delivery and 4+ years in dedicated Scrum Master / Agile Delivery Lead roles. Facilitate Scrum ceremonies — Sprint Planning, Daily Stand-ups, Sprint Reviews, Retrospectives, and Backlog Refinement — and collaborate closely with Product Owners, Business Analysts, Development, QA, and leadership teams to drive end-to-end delivery across matrixed, multi-team, and globally distributed environments, including financial services digital transformation programs.</w:t>
       </w:r>
     </w:p>
     <w:p>
@@ -96,26 +115,7 @@
           <w:sz w:val="20"/>
           <w:szCs w:val="20"/>
         </w:rPr>
-        <w:t xml:space="preserve">Strong in sprint planning, backlog management, risk and dependency governance, stakeholder and vendor management, and Agile ceremony facilitation, with solid grounding in SDLC and modern development practices, backed by hands-on JIRA and Confluence expertise. Practical exposure to SAFe practices — including PI Planning and coordination with Release Train Engineers — alongside Kanban , applying a data-driven approach to monitor team performance and drive continuous improvement across multicultural, globally distributed teams. Early adopter of AI-augmented delivery practices — using Claude LLM-based AI agents for project planning, delivery tracking, dynamic executive reporting, and spec-driven initiative generation. </w:t>
-      </w:r>
-      <w:r>
-        <w:rPr>
-          <w:rFonts w:hint="default" w:ascii="Arial" w:hAnsi="Arial" w:eastAsia="Arial" w:cs="Arial"/>
-          <w:color w:val="232323"/>
-          <w:sz w:val="20"/>
-          <w:szCs w:val="20"/>
-          <w:lang w:val="en-US"/>
-        </w:rPr>
-        <w:t xml:space="preserve">Completed </w:t>
-      </w:r>
-      <w:r>
-        <w:rPr>
-          <w:rFonts w:ascii="Arial" w:hAnsi="Arial" w:eastAsia="Arial" w:cs="Arial"/>
-          <w:color w:val="232323"/>
-          <w:sz w:val="20"/>
-          <w:szCs w:val="20"/>
-        </w:rPr>
-        <w:t xml:space="preserve"> the Leadership with AI program at ISB Hyderabad </w:t>
+        <w:t>PMP and CSM certified; coach teams and stakeholders on Agile principles, Scrum practices, and continuous improvement, removing impediments and managing delivery risks, dependencies, and escalations to keep sprints on track. Track Agile metrics — including velocity, sprint burndown, and team performance — via JIRA dashboards, promoting accountability, transparency, collaboration, and self-organization across multicultural, globally distributed teams. Support release planning, backlog prioritization, and enterprise Agile adoption, ensuring adherence to Agile governance, delivery standards, and quality practices — backed by hands-on JIRA and Confluence expertise and practical exposure to SAFe, including PI Planning and coordination with Release Train Engineers. Early adopter of AI-augmented delivery practices — using Claude LLM-based AI agents for project planning, delivery tracking, dynamic executive reporting, and spec-driven initiative generation. Completed the Leadership with AI program at ISB Hyderabad.</w:t>
       </w:r>
     </w:p>
     <w:p>
@@ -250,7 +250,7 @@
                 <w:sz w:val="20"/>
                 <w:szCs w:val="20"/>
               </w:rPr>
-              <w:t>Scrum Maturity Coaching &amp; Team Empowerment</w:t>
+              <w:t>Agile/Scrum Coaching for Teams &amp; Stakeholders</w:t>
             </w:r>
           </w:p>
         </w:tc>
@@ -342,7 +342,7 @@
                 <w:sz w:val="20"/>
                 <w:szCs w:val="20"/>
               </w:rPr>
-              <w:t>JIRA  Administration and Automation</w:t>
+              <w:t>JIRA Administration and Automation</w:t>
             </w:r>
           </w:p>
         </w:tc>
@@ -489,7 +489,7 @@
                 <w:sz w:val="20"/>
                 <w:szCs w:val="20"/>
               </w:rPr>
-              <w:t>Risk, Issue &amp; Dependency Management</w:t>
+              <w:t>Risk, Dependency &amp; Escalation Management</w:t>
             </w:r>
           </w:p>
         </w:tc>
@@ -581,7 +581,7 @@
                 <w:sz w:val="20"/>
                 <w:szCs w:val="20"/>
               </w:rPr>
-              <w:t>Stakeholder &amp; Executive Communication (Western/Global Markets)</w:t>
+              <w:t>Cross-Functional Collaboration (Product, BA, Dev, QA, Leadership)</w:t>
             </w:r>
           </w:p>
         </w:tc>
@@ -618,99 +618,7 @@
                 <w:sz w:val="20"/>
                 <w:szCs w:val="20"/>
               </w:rPr>
-              <w:t>RPA &amp; Process Automation (UiPath)</w:t>
-            </w:r>
-          </w:p>
-        </w:tc>
-      </w:tr>
-      <w:tr>
-        <w:tblPrEx>
-          <w:tblBorders>
-            <w:top w:val="none" w:color="FFFFFF" w:sz="0" w:space="0"/>
-            <w:left w:val="none" w:color="FFFFFF" w:sz="0" w:space="0"/>
-            <w:bottom w:val="none" w:color="FFFFFF" w:sz="0" w:space="0"/>
-            <w:right w:val="none" w:color="FFFFFF" w:sz="0" w:space="0"/>
-            <w:insideH w:val="single" w:color="auto" w:sz="4" w:space="0"/>
-            <w:insideV w:val="single" w:color="auto" w:sz="4" w:space="0"/>
-          </w:tblBorders>
-          <w:tblCellMar>
-            <w:top w:w="0" w:type="dxa"/>
-            <w:left w:w="10" w:type="dxa"/>
-            <w:bottom w:w="0" w:type="dxa"/>
-            <w:right w:w="10" w:type="dxa"/>
-          </w:tblCellMar>
-        </w:tblPrEx>
-        <w:tc>
-          <w:tcPr>
-            <w:tcW w:w="5089" w:type="dxa"/>
-            <w:tcBorders>
-              <w:top w:val="nil"/>
-              <w:left w:val="nil"/>
-              <w:bottom w:val="nil"/>
-              <w:right w:val="nil"/>
-            </w:tcBorders>
-            <w:tcMar>
-              <w:top w:w="20" w:type="dxa"/>
-              <w:left w:w="0" w:type="dxa"/>
-              <w:bottom w:w="20" w:type="dxa"/>
-              <w:right w:w="140" w:type="dxa"/>
-            </w:tcMar>
-            <w:vAlign w:val="top"/>
-          </w:tcPr>
-          <w:p>
-            <w:pPr>
-              <w:pStyle w:val="16"/>
-              <w:numPr>
-                <w:ilvl w:val="0"/>
-                <w:numId w:val="1"/>
-              </w:numPr>
-              <w:spacing w:after="60"/>
-            </w:pPr>
-            <w:r>
-              <w:rPr>
-                <w:rFonts w:ascii="Arial" w:hAnsi="Arial" w:eastAsia="Arial" w:cs="Arial"/>
-                <w:color w:val="232323"/>
-                <w:sz w:val="20"/>
-                <w:szCs w:val="20"/>
-              </w:rPr>
-              <w:t>Vendor &amp; Cross-Functional Team Management</w:t>
-            </w:r>
-          </w:p>
-        </w:tc>
-        <w:tc>
-          <w:tcPr>
-            <w:tcW w:w="5089" w:type="dxa"/>
-            <w:tcBorders>
-              <w:top w:val="nil"/>
-              <w:left w:val="nil"/>
-              <w:bottom w:val="nil"/>
-              <w:right w:val="nil"/>
-            </w:tcBorders>
-            <w:tcMar>
-              <w:top w:w="20" w:type="dxa"/>
-              <w:left w:w="0" w:type="dxa"/>
-              <w:bottom w:w="20" w:type="dxa"/>
-              <w:right w:w="140" w:type="dxa"/>
-            </w:tcMar>
-            <w:vAlign w:val="top"/>
-          </w:tcPr>
-          <w:p>
-            <w:pPr>
-              <w:pStyle w:val="16"/>
-              <w:numPr>
-                <w:ilvl w:val="0"/>
-                <w:numId w:val="1"/>
-              </w:numPr>
-              <w:spacing w:after="60"/>
-            </w:pPr>
-            <w:r>
-              <w:rPr>
-                <w:rFonts w:ascii="Arial" w:hAnsi="Arial" w:eastAsia="Arial" w:cs="Arial"/>
-                <w:color w:val="232323"/>
-                <w:sz w:val="20"/>
-                <w:szCs w:val="20"/>
-              </w:rPr>
-              <w:t>Acceptance Criteria / Definition of Done Governance</w:t>
+              <w:t>Agile Governance &amp; Delivery Standards (AC/DoD Compliance)</w:t>
             </w:r>
           </w:p>
         </w:tc>
@@ -857,7 +765,7 @@
                 <w:sz w:val="20"/>
                 <w:szCs w:val="20"/>
               </w:rPr>
-              <w:t>Scrum Ceremony Facilitation &amp; Scrum-of-Scrums</w:t>
+              <w:t>Scrum Ceremony Facilitation (Sprint Planning, Stand-ups, Reviews, Retrospectives)</w:t>
             </w:r>
           </w:p>
         </w:tc>
@@ -894,201 +802,7 @@
                 <w:sz w:val="20"/>
                 <w:szCs w:val="20"/>
               </w:rPr>
-              <w:t>Test Strategy &amp; Release Quality Governance</w:t>
-            </w:r>
-          </w:p>
-        </w:tc>
-      </w:tr>
-      <w:tr>
-        <w:tblPrEx>
-          <w:tblBorders>
-            <w:top w:val="none" w:color="FFFFFF" w:sz="0" w:space="0"/>
-            <w:left w:val="none" w:color="FFFFFF" w:sz="0" w:space="0"/>
-            <w:bottom w:val="none" w:color="FFFFFF" w:sz="0" w:space="0"/>
-            <w:right w:val="none" w:color="FFFFFF" w:sz="0" w:space="0"/>
-            <w:insideH w:val="single" w:color="auto" w:sz="4" w:space="0"/>
-            <w:insideV w:val="single" w:color="auto" w:sz="4" w:space="0"/>
-          </w:tblBorders>
-          <w:tblCellMar>
-            <w:top w:w="0" w:type="dxa"/>
-            <w:left w:w="10" w:type="dxa"/>
-            <w:bottom w:w="0" w:type="dxa"/>
-            <w:right w:w="10" w:type="dxa"/>
-          </w:tblCellMar>
-        </w:tblPrEx>
-        <w:tc>
-          <w:tcPr>
-            <w:tcW w:w="5089" w:type="dxa"/>
-            <w:tcBorders>
-              <w:top w:val="nil"/>
-              <w:left w:val="nil"/>
-              <w:bottom w:val="nil"/>
-              <w:right w:val="nil"/>
-            </w:tcBorders>
-            <w:tcMar>
-              <w:top w:w="20" w:type="dxa"/>
-              <w:left w:w="0" w:type="dxa"/>
-              <w:bottom w:w="20" w:type="dxa"/>
-              <w:right w:w="140" w:type="dxa"/>
-            </w:tcMar>
-            <w:vAlign w:val="top"/>
-          </w:tcPr>
-          <w:p>
-            <w:pPr>
-              <w:pStyle w:val="16"/>
-              <w:numPr>
-                <w:ilvl w:val="0"/>
-                <w:numId w:val="1"/>
-              </w:numPr>
-              <w:spacing w:after="60"/>
-            </w:pPr>
-            <w:r>
-              <w:rPr>
-                <w:rFonts w:ascii="Arial" w:hAnsi="Arial" w:eastAsia="Arial" w:cs="Arial"/>
-                <w:color w:val="232323"/>
-                <w:sz w:val="20"/>
-                <w:szCs w:val="20"/>
-              </w:rPr>
-              <w:t>Financial Services &amp; Digital Transformation Delivery</w:t>
-            </w:r>
-          </w:p>
-        </w:tc>
-        <w:tc>
-          <w:tcPr>
-            <w:tcW w:w="5089" w:type="dxa"/>
-            <w:tcBorders>
-              <w:top w:val="nil"/>
-              <w:left w:val="nil"/>
-              <w:bottom w:val="nil"/>
-              <w:right w:val="nil"/>
-            </w:tcBorders>
-            <w:tcMar>
-              <w:top w:w="20" w:type="dxa"/>
-              <w:left w:w="0" w:type="dxa"/>
-              <w:bottom w:w="20" w:type="dxa"/>
-              <w:right w:w="140" w:type="dxa"/>
-            </w:tcMar>
-            <w:vAlign w:val="top"/>
-          </w:tcPr>
-          <w:p>
-            <w:pPr>
-              <w:pStyle w:val="16"/>
-              <w:numPr>
-                <w:ilvl w:val="0"/>
-                <w:numId w:val="1"/>
-              </w:numPr>
-              <w:spacing w:after="60"/>
-            </w:pPr>
-            <w:r>
-              <w:rPr>
-                <w:rFonts w:ascii="Arial" w:hAnsi="Arial" w:eastAsia="Arial" w:cs="Arial"/>
-                <w:color w:val="232323"/>
-                <w:sz w:val="20"/>
-                <w:szCs w:val="20"/>
-              </w:rPr>
-              <w:t>Self-Organizing Team Coaching</w:t>
-            </w:r>
-          </w:p>
-        </w:tc>
-      </w:tr>
-      <w:tr>
-        <w:tblPrEx>
-          <w:tblBorders>
-            <w:top w:val="none" w:color="FFFFFF" w:sz="0" w:space="0"/>
-            <w:left w:val="none" w:color="FFFFFF" w:sz="0" w:space="0"/>
-            <w:bottom w:val="none" w:color="FFFFFF" w:sz="0" w:space="0"/>
-            <w:right w:val="none" w:color="FFFFFF" w:sz="0" w:space="0"/>
-            <w:insideH w:val="single" w:color="auto" w:sz="4" w:space="0"/>
-            <w:insideV w:val="single" w:color="auto" w:sz="4" w:space="0"/>
-          </w:tblBorders>
-          <w:tblCellMar>
-            <w:top w:w="0" w:type="dxa"/>
-            <w:left w:w="10" w:type="dxa"/>
-            <w:bottom w:w="0" w:type="dxa"/>
-            <w:right w:w="10" w:type="dxa"/>
-          </w:tblCellMar>
-        </w:tblPrEx>
-        <w:tc>
-          <w:tcPr>
-            <w:tcW w:w="5089" w:type="dxa"/>
-            <w:tcBorders>
-              <w:top w:val="nil"/>
-              <w:left w:val="nil"/>
-              <w:bottom w:val="nil"/>
-              <w:right w:val="nil"/>
-            </w:tcBorders>
-            <w:tcMar>
-              <w:top w:w="20" w:type="dxa"/>
-              <w:left w:w="0" w:type="dxa"/>
-              <w:bottom w:w="20" w:type="dxa"/>
-              <w:right w:w="140" w:type="dxa"/>
-            </w:tcMar>
-            <w:vAlign w:val="top"/>
-          </w:tcPr>
-          <w:p>
-            <w:pPr>
-              <w:pStyle w:val="16"/>
-              <w:numPr>
-                <w:ilvl w:val="0"/>
-                <w:numId w:val="1"/>
-              </w:numPr>
-              <w:spacing w:after="60"/>
-            </w:pPr>
-            <w:r>
-              <w:rPr>
-                <w:rFonts w:ascii="Arial" w:hAnsi="Arial" w:eastAsia="Arial" w:cs="Arial"/>
-                <w:color w:val="232323"/>
-                <w:sz w:val="20"/>
-                <w:szCs w:val="20"/>
-              </w:rPr>
-              <w:t>SAFe Practices, PI Planning &amp; RTE Collaboration</w:t>
-            </w:r>
-          </w:p>
-        </w:tc>
-        <w:tc>
-          <w:tcPr>
-            <w:tcW w:w="5089" w:type="dxa"/>
-            <w:tcBorders>
-              <w:top w:val="nil"/>
-              <w:left w:val="nil"/>
-              <w:bottom w:val="nil"/>
-              <w:right w:val="nil"/>
-            </w:tcBorders>
-            <w:tcMar>
-              <w:top w:w="20" w:type="dxa"/>
-              <w:left w:w="0" w:type="dxa"/>
-              <w:bottom w:w="20" w:type="dxa"/>
-              <w:right w:w="140" w:type="dxa"/>
-            </w:tcMar>
-            <w:vAlign w:val="top"/>
-          </w:tcPr>
-          <w:p>
-            <w:pPr>
-              <w:pStyle w:val="16"/>
-              <w:numPr>
-                <w:ilvl w:val="0"/>
-                <w:numId w:val="1"/>
-              </w:numPr>
-              <w:spacing w:after="60"/>
-            </w:pPr>
-            <w:r>
-              <w:rPr>
-                <w:rFonts w:ascii="Arial" w:hAnsi="Arial" w:eastAsia="Arial" w:cs="Arial"/>
-                <w:color w:val="232323"/>
-                <w:sz w:val="20"/>
-                <w:szCs w:val="20"/>
-              </w:rPr>
-              <w:t>Kanban</w:t>
-            </w:r>
-            <w:r>
-              <w:rPr>
-                <w:rFonts w:hint="default" w:ascii="Arial" w:hAnsi="Arial" w:eastAsia="Arial" w:cs="Arial"/>
-                <w:color w:val="232323"/>
-                <w:sz w:val="20"/>
-                <w:szCs w:val="20"/>
-                <w:lang w:val="en-US"/>
-              </w:rPr>
-              <w:t xml:space="preserve"> &amp; Scrum</w:t>
+              <w:t>Release Planning &amp; Quality Governance</w:t>
             </w:r>
           </w:p>
         </w:tc>
@@ -1185,6 +899,98 @@
           </w:p>
         </w:tc>
       </w:tr>
+      <w:tr>
+        <w:tblPrEx>
+          <w:tblBorders>
+            <w:top w:val="none" w:color="FFFFFF" w:sz="0" w:space="0"/>
+            <w:left w:val="none" w:color="FFFFFF" w:sz="0" w:space="0"/>
+            <w:bottom w:val="none" w:color="FFFFFF" w:sz="0" w:space="0"/>
+            <w:right w:val="none" w:color="FFFFFF" w:sz="0" w:space="0"/>
+            <w:insideH w:val="single" w:color="auto" w:sz="4" w:space="0"/>
+            <w:insideV w:val="single" w:color="auto" w:sz="4" w:space="0"/>
+          </w:tblBorders>
+          <w:tblCellMar>
+            <w:top w:w="0" w:type="dxa"/>
+            <w:left w:w="10" w:type="dxa"/>
+            <w:bottom w:w="0" w:type="dxa"/>
+            <w:right w:w="10" w:type="dxa"/>
+          </w:tblCellMar>
+        </w:tblPrEx>
+        <w:tc>
+          <w:tcPr>
+            <w:tcW w:w="5089" w:type="dxa"/>
+            <w:tcBorders>
+              <w:top w:val="nil"/>
+              <w:left w:val="nil"/>
+              <w:bottom w:val="nil"/>
+              <w:right w:val="nil"/>
+            </w:tcBorders>
+            <w:tcMar>
+              <w:top w:w="20" w:type="dxa"/>
+              <w:left w:w="0" w:type="dxa"/>
+              <w:bottom w:w="20" w:type="dxa"/>
+              <w:right w:w="140" w:type="dxa"/>
+            </w:tcMar>
+            <w:vAlign w:val="top"/>
+          </w:tcPr>
+          <w:p>
+            <w:pPr>
+              <w:pStyle w:val="16"/>
+              <w:numPr>
+                <w:ilvl w:val="0"/>
+                <w:numId w:val="1"/>
+              </w:numPr>
+              <w:spacing w:after="60"/>
+            </w:pPr>
+            <w:r>
+              <w:rPr>
+                <w:rFonts w:ascii="Arial" w:hAnsi="Arial" w:eastAsia="Arial" w:cs="Arial"/>
+                <w:color w:val="232323"/>
+                <w:sz w:val="20"/>
+                <w:szCs w:val="20"/>
+              </w:rPr>
+              <w:t>Agile Metrics Tracking (Velocity, Burndown &amp; Sprint Progress)</w:t>
+            </w:r>
+          </w:p>
+        </w:tc>
+        <w:tc>
+          <w:tcPr>
+            <w:tcW w:w="5089" w:type="dxa"/>
+            <w:tcBorders>
+              <w:top w:val="nil"/>
+              <w:left w:val="nil"/>
+              <w:bottom w:val="nil"/>
+              <w:right w:val="nil"/>
+            </w:tcBorders>
+            <w:tcMar>
+              <w:top w:w="20" w:type="dxa"/>
+              <w:left w:w="0" w:type="dxa"/>
+              <w:bottom w:w="20" w:type="dxa"/>
+              <w:right w:w="140" w:type="dxa"/>
+            </w:tcMar>
+            <w:vAlign w:val="top"/>
+          </w:tcPr>
+          <w:p>
+            <w:pPr>
+              <w:pStyle w:val="16"/>
+              <w:numPr>
+                <w:ilvl w:val="0"/>
+                <w:numId w:val="1"/>
+              </w:numPr>
+              <w:spacing w:after="60"/>
+            </w:pPr>
+            <w:r>
+              <w:rPr>
+                <w:rFonts w:ascii="Arial" w:hAnsi="Arial" w:eastAsia="Arial" w:cs="Arial"/>
+                <w:color w:val="232323"/>
+                <w:sz w:val="20"/>
+                <w:szCs w:val="20"/>
+              </w:rPr>
+              <w:t>Enterprise Agile Adoption &amp; Transformation Coaching</w:t>
+            </w:r>
+          </w:p>
+        </w:tc>
+      </w:tr>
     </w:tbl>
     <w:p>
       <w:pPr>
@@ -1192,8 +998,6 @@
           <w:bottom w:val="single" w:color="D9DEE3" w:sz="6" w:space="4"/>
         </w:pBdr>
         <w:spacing w:before="260" w:after="120"/>
-      </w:pPr>
-      <w:r>
         <w:rPr>
           <w:rFonts w:ascii="Arial" w:hAnsi="Arial" w:eastAsia="Arial" w:cs="Arial"/>
           <w:b/>
@@ -1203,6 +1007,25 @@
           <w:sz w:val="21"/>
           <w:szCs w:val="21"/>
         </w:rPr>
+      </w:pPr>
+    </w:p>
+    <w:p>
+      <w:pPr>
+        <w:pBdr>
+          <w:bottom w:val="single" w:color="D9DEE3" w:sz="6" w:space="4"/>
+        </w:pBdr>
+        <w:spacing w:before="260" w:after="120"/>
+      </w:pPr>
+      <w:r>
+        <w:rPr>
+          <w:rFonts w:ascii="Arial" w:hAnsi="Arial" w:eastAsia="Arial" w:cs="Arial"/>
+          <w:b/>
+          <w:bCs/>
+          <w:color w:val="1F4E79"/>
+          <w:spacing w:val="14"/>
+          <w:sz w:val="21"/>
+          <w:szCs w:val="21"/>
+        </w:rPr>
         <w:t>AI-AUGMENTED DELIVERY HIGHLIGHTS</w:t>
       </w:r>
     </w:p>
@@ -1307,6 +1130,23 @@
         </w:rPr>
         <w:t>Claude-powered agent for automated bug analysis (front-end vs. back-end classification), requirements querying, and case support — reduced manual case-handling effort by an estimated ~35% and improved renewal turnaround time.</w:t>
       </w:r>
+    </w:p>
+    <w:p>
+      <w:pPr>
+        <w:pBdr>
+          <w:bottom w:val="single" w:color="D9DEE3" w:sz="6" w:space="4"/>
+        </w:pBdr>
+        <w:spacing w:before="260" w:after="120"/>
+        <w:rPr>
+          <w:rFonts w:ascii="Arial" w:hAnsi="Arial" w:eastAsia="Arial" w:cs="Arial"/>
+          <w:b/>
+          <w:bCs/>
+          <w:color w:val="1F4E79"/>
+          <w:spacing w:val="14"/>
+          <w:sz w:val="21"/>
+          <w:szCs w:val="21"/>
+        </w:rPr>
+      </w:pPr>
     </w:p>
     <w:p>
       <w:pPr>
@@ -1603,456 +1443,6 @@
       </w:pPr>
       <w:r>
         <w:rPr>
-          <w:rFonts w:ascii="Arial" w:hAnsi="Arial" w:eastAsia="Arial" w:cs="Arial"/>
-          <w:i/>
-          <w:iCs/>
-          <w:color w:val="1F4E79"/>
-          <w:sz w:val="21"/>
-          <w:szCs w:val="21"/>
-        </w:rPr>
-        <w:t>Business Consultant – Project Management (Agile Delivery Lead / Scrum Master)</w:t>
-      </w:r>
-      <w:r>
-        <w:rPr>
-          <w:rFonts w:ascii="Arial" w:hAnsi="Arial" w:eastAsia="Arial" w:cs="Arial"/>
-          <w:color w:val="6B7280"/>
-          <w:sz w:val="18"/>
-          <w:szCs w:val="18"/>
-        </w:rPr>
-        <w:tab/>
-        <w:t>Apr 2024 – Present</w:t>
-      </w:r>
-    </w:p>
-    <w:p>
-      <w:pPr>
-        <w:pStyle w:val="16"/>
-        <w:numPr>
-          <w:ilvl w:val="0"/>
-          <w:numId w:val="1"/>
-        </w:numPr>
-        <w:spacing w:after="40" w:line="250" w:lineRule="auto"/>
-        <w:jc w:val="both"/>
-      </w:pPr>
-      <w:r>
-        <w:rPr>
-          <w:rFonts w:ascii="Arial" w:hAnsi="Arial" w:eastAsia="Arial" w:cs="Arial"/>
-          <w:color w:val="232323"/>
-          <w:sz w:val="20"/>
-          <w:szCs w:val="20"/>
-        </w:rPr>
-        <w:t>Operating as Agile Delivery Lead / Scrum Master on Allianz’s financial services digital transformation initiatives — first the Motor Retail application development program, currently Motor Renewals — owning end-to-end delivery across planning, execution, and release, and coaching teams toward self-organization and customer satisfaction.</w:t>
-      </w:r>
-    </w:p>
-    <w:p>
-      <w:pPr>
-        <w:pStyle w:val="16"/>
-        <w:numPr>
-          <w:ilvl w:val="0"/>
-          <w:numId w:val="1"/>
-        </w:numPr>
-        <w:spacing w:after="40" w:line="250" w:lineRule="auto"/>
-        <w:jc w:val="both"/>
-      </w:pPr>
-      <w:r>
-        <w:rPr>
-          <w:rFonts w:ascii="Arial" w:hAnsi="Arial" w:eastAsia="Arial" w:cs="Arial"/>
-          <w:color w:val="232323"/>
-          <w:sz w:val="20"/>
-          <w:szCs w:val="20"/>
-        </w:rPr>
-        <w:t>Facilitate the full Agile ceremony cadence within a SAFe (Scaled Agile Framework) environment — including PI Planning, sprint planning, daily stand-ups, backlog refinement, sprint reviews, and retrospectives — in close coordination with Release Train Engineers, driving consistent, predictable delivery of business value.</w:t>
-      </w:r>
-    </w:p>
-    <w:p>
-      <w:pPr>
-        <w:pStyle w:val="16"/>
-        <w:numPr>
-          <w:ilvl w:val="0"/>
-          <w:numId w:val="1"/>
-        </w:numPr>
-        <w:spacing w:after="40" w:line="250" w:lineRule="auto"/>
-        <w:jc w:val="both"/>
-      </w:pPr>
-      <w:r>
-        <w:rPr>
-          <w:rFonts w:ascii="Arial" w:hAnsi="Arial" w:eastAsia="Arial" w:cs="Arial"/>
-          <w:color w:val="232323"/>
-          <w:sz w:val="20"/>
-          <w:szCs w:val="20"/>
-        </w:rPr>
-        <w:t>Coach teams on Agile best practices, strengthening engineering maturity and continuous delivery capability.</w:t>
-      </w:r>
-    </w:p>
-    <w:p>
-      <w:pPr>
-        <w:pStyle w:val="16"/>
-        <w:numPr>
-          <w:ilvl w:val="0"/>
-          <w:numId w:val="1"/>
-        </w:numPr>
-        <w:spacing w:after="40" w:line="250" w:lineRule="auto"/>
-        <w:jc w:val="both"/>
-      </w:pPr>
-      <w:r>
-        <w:rPr>
-          <w:rFonts w:ascii="Arial" w:hAnsi="Arial" w:eastAsia="Arial" w:cs="Arial"/>
-          <w:color w:val="232323"/>
-          <w:sz w:val="20"/>
-          <w:szCs w:val="20"/>
-        </w:rPr>
-        <w:t>Own risk, assumption, issue, and dependency (RAID) management; proactively remove impediments and blockers to maintain optimal team flow.</w:t>
-      </w:r>
-    </w:p>
-    <w:p>
-      <w:pPr>
-        <w:pStyle w:val="16"/>
-        <w:numPr>
-          <w:ilvl w:val="0"/>
-          <w:numId w:val="1"/>
-        </w:numPr>
-        <w:spacing w:after="40" w:line="250" w:lineRule="auto"/>
-        <w:jc w:val="both"/>
-      </w:pPr>
-      <w:r>
-        <w:rPr>
-          <w:rFonts w:ascii="Arial" w:hAnsi="Arial" w:eastAsia="Arial" w:cs="Arial"/>
-          <w:color w:val="232323"/>
-          <w:sz w:val="20"/>
-          <w:szCs w:val="20"/>
-        </w:rPr>
-        <w:t>Partner with Product Owners and Business Analysts on requirements gathering, backlog grooming, and sprint commitment; create and maintain delivery roadmaps and milestone plans.</w:t>
-      </w:r>
-    </w:p>
-    <w:p>
-      <w:pPr>
-        <w:pStyle w:val="16"/>
-        <w:numPr>
-          <w:ilvl w:val="0"/>
-          <w:numId w:val="1"/>
-        </w:numPr>
-        <w:spacing w:after="40" w:line="250" w:lineRule="auto"/>
-        <w:jc w:val="both"/>
-      </w:pPr>
-      <w:r>
-        <w:rPr>
-          <w:rFonts w:ascii="Arial" w:hAnsi="Arial" w:eastAsia="Arial" w:cs="Arial"/>
-          <w:color w:val="232323"/>
-          <w:sz w:val="20"/>
-          <w:szCs w:val="20"/>
-        </w:rPr>
-        <w:t>Drive stakeholder and change management across cross-functional, matrixed teams; lead Scrum-of-Scrums sessions to manage cross-team dependencies and program alignment, and report delivery status to senior management forums.</w:t>
-      </w:r>
-    </w:p>
-    <w:p>
-      <w:pPr>
-        <w:pStyle w:val="16"/>
-        <w:numPr>
-          <w:ilvl w:val="0"/>
-          <w:numId w:val="1"/>
-        </w:numPr>
-        <w:spacing w:after="40" w:line="250" w:lineRule="auto"/>
-        <w:jc w:val="both"/>
-      </w:pPr>
-      <w:r>
-        <w:rPr>
-          <w:rFonts w:ascii="Arial" w:hAnsi="Arial" w:eastAsia="Arial" w:cs="Arial"/>
-          <w:color w:val="232323"/>
-          <w:sz w:val="20"/>
-          <w:szCs w:val="20"/>
-        </w:rPr>
-        <w:t>Designed and deployed the Motor Renewals AI Agent (Claude LLMs) for automated bug analysis, requirements querying, and case support.</w:t>
-      </w:r>
-    </w:p>
-    <w:p>
-      <w:pPr>
-        <w:pStyle w:val="16"/>
-        <w:numPr>
-          <w:ilvl w:val="0"/>
-          <w:numId w:val="1"/>
-        </w:numPr>
-        <w:spacing w:after="40" w:line="250" w:lineRule="auto"/>
-        <w:jc w:val="both"/>
-      </w:pPr>
-      <w:r>
-        <w:rPr>
-          <w:rFonts w:ascii="Arial" w:hAnsi="Arial" w:eastAsia="Arial" w:cs="Arial"/>
-          <w:color w:val="232323"/>
-          <w:sz w:val="20"/>
-          <w:szCs w:val="20"/>
-        </w:rPr>
-        <w:t>Automated leave and timesheet reminders for the team, cutting manual follow-up effort by ~80% and improving on-time compliance by ~25%.</w:t>
-      </w:r>
-    </w:p>
-    <w:p>
-      <w:pPr>
-        <w:pStyle w:val="16"/>
-        <w:numPr>
-          <w:ilvl w:val="0"/>
-          <w:numId w:val="1"/>
-        </w:numPr>
-        <w:spacing w:after="40" w:line="250" w:lineRule="auto"/>
-        <w:jc w:val="both"/>
-      </w:pPr>
-      <w:r>
-        <w:rPr>
-          <w:rFonts w:ascii="Arial" w:hAnsi="Arial" w:eastAsia="Arial" w:cs="Arial"/>
-          <w:color w:val="232323"/>
-          <w:sz w:val="20"/>
-          <w:szCs w:val="20"/>
-        </w:rPr>
-        <w:t>Automated retrospective survey forms, increasing team participation in retrospectives by ~30% while reducing administrative overhead.</w:t>
-      </w:r>
-    </w:p>
-    <w:p>
-      <w:pPr>
-        <w:pStyle w:val="16"/>
-        <w:numPr>
-          <w:ilvl w:val="0"/>
-          <w:numId w:val="1"/>
-        </w:numPr>
-        <w:spacing w:after="40" w:line="250" w:lineRule="auto"/>
-        <w:jc w:val="both"/>
-      </w:pPr>
-      <w:r>
-        <w:rPr>
-          <w:rFonts w:ascii="Arial" w:hAnsi="Arial" w:eastAsia="Arial" w:cs="Arial"/>
-          <w:color w:val="232323"/>
-          <w:sz w:val="20"/>
-          <w:szCs w:val="20"/>
-        </w:rPr>
-        <w:t>Built ReportPilot, a Claude Code-developed Python tool automating program status reporting via the Jira REST API.</w:t>
-      </w:r>
-    </w:p>
-    <w:p>
-      <w:pPr>
-        <w:pStyle w:val="16"/>
-        <w:numPr>
-          <w:ilvl w:val="0"/>
-          <w:numId w:val="1"/>
-        </w:numPr>
-        <w:spacing w:after="40" w:line="250" w:lineRule="auto"/>
-        <w:jc w:val="both"/>
-      </w:pPr>
-      <w:r>
-        <w:rPr>
-          <w:rFonts w:ascii="Arial" w:hAnsi="Arial" w:eastAsia="Arial" w:cs="Arial"/>
-          <w:color w:val="232323"/>
-          <w:sz w:val="20"/>
-          <w:szCs w:val="20"/>
-        </w:rPr>
-        <w:t>Led enterprise-scale Claude AI agent adoption across a 40-member, five-team program, driving strong adoption and measurable delivery gains.</w:t>
-      </w:r>
-    </w:p>
-    <w:p>
-      <w:pPr>
-        <w:pStyle w:val="16"/>
-        <w:numPr>
-          <w:ilvl w:val="0"/>
-          <w:numId w:val="1"/>
-        </w:numPr>
-        <w:spacing w:after="40" w:line="250" w:lineRule="auto"/>
-        <w:jc w:val="both"/>
-      </w:pPr>
-      <w:r>
-        <w:rPr>
-          <w:rFonts w:ascii="Arial" w:hAnsi="Arial" w:eastAsia="Arial" w:cs="Arial"/>
-          <w:color w:val="232323"/>
-          <w:sz w:val="20"/>
-          <w:szCs w:val="20"/>
-        </w:rPr>
-        <w:t>Own JIRA dashboard design and JIRA automation, and enforce Acceptance Criteria / Definition of Done compliance across all team deliverables.</w:t>
-      </w:r>
-    </w:p>
-    <w:p>
-      <w:pPr>
-        <w:pStyle w:val="16"/>
-        <w:numPr>
-          <w:ilvl w:val="0"/>
-          <w:numId w:val="1"/>
-        </w:numPr>
-        <w:spacing w:after="40" w:line="250" w:lineRule="auto"/>
-        <w:jc w:val="both"/>
-      </w:pPr>
-      <w:r>
-        <w:rPr>
-          <w:rFonts w:ascii="Arial" w:hAnsi="Arial" w:eastAsia="Arial" w:cs="Arial"/>
-          <w:color w:val="232323"/>
-          <w:sz w:val="20"/>
-          <w:szCs w:val="20"/>
-        </w:rPr>
-        <w:t>Lead the team handling production support, ensuring incidents are logged and tracked in ServiceNow, and liaising with business stakeholders to resolve developer and QA queries on open incidents.</w:t>
-      </w:r>
-    </w:p>
-    <w:p>
-      <w:pPr>
-        <w:pStyle w:val="16"/>
-        <w:numPr>
-          <w:ilvl w:val="0"/>
-          <w:numId w:val="1"/>
-        </w:numPr>
-        <w:spacing w:after="40" w:line="250" w:lineRule="auto"/>
-        <w:jc w:val="both"/>
-      </w:pPr>
-      <w:r>
-        <w:rPr>
-          <w:rFonts w:ascii="Arial" w:hAnsi="Arial" w:eastAsia="Arial" w:cs="Arial"/>
-          <w:color w:val="232323"/>
-          <w:sz w:val="20"/>
-          <w:szCs w:val="20"/>
-        </w:rPr>
-        <w:t>Built ServiceNow incident dashboards — including one developed using Claude — to give leadership real-time visibility into incident volume, status, and trends.</w:t>
-      </w:r>
-    </w:p>
-    <w:p>
-      <w:pPr>
-        <w:spacing w:before="140" w:after="20"/>
-      </w:pPr>
-      <w:r>
-        <w:rPr>
-          <w:rFonts w:ascii="Arial" w:hAnsi="Arial" w:eastAsia="Arial" w:cs="Arial"/>
-          <w:b/>
-          <w:bCs/>
-          <w:color w:val="232323"/>
-          <w:sz w:val="22"/>
-          <w:szCs w:val="22"/>
-        </w:rPr>
-        <w:t>Indium Software</w:t>
-      </w:r>
-    </w:p>
-    <w:p>
-      <w:pPr>
-        <w:tabs>
-          <w:tab w:val="right" w:pos="10178"/>
-        </w:tabs>
-        <w:spacing w:after="80"/>
-      </w:pPr>
-      <w:r>
-        <w:rPr>
-          <w:rFonts w:ascii="Arial" w:hAnsi="Arial" w:eastAsia="Arial" w:cs="Arial"/>
-          <w:i/>
-          <w:iCs/>
-          <w:color w:val="1F4E79"/>
-          <w:sz w:val="21"/>
-          <w:szCs w:val="21"/>
-        </w:rPr>
-        <w:t>Project Manager / Scrum Master</w:t>
-      </w:r>
-      <w:r>
-        <w:rPr>
-          <w:rFonts w:ascii="Arial" w:hAnsi="Arial" w:eastAsia="Arial" w:cs="Arial"/>
-          <w:color w:val="6B7280"/>
-          <w:sz w:val="18"/>
-          <w:szCs w:val="18"/>
-        </w:rPr>
-        <w:tab/>
-        <w:t>Dec 2022 – Nov 2023</w:t>
-      </w:r>
-    </w:p>
-    <w:p>
-      <w:pPr>
-        <w:pStyle w:val="16"/>
-        <w:numPr>
-          <w:ilvl w:val="0"/>
-          <w:numId w:val="1"/>
-        </w:numPr>
-        <w:spacing w:after="40" w:line="250" w:lineRule="auto"/>
-        <w:jc w:val="both"/>
-      </w:pPr>
-      <w:r>
-        <w:rPr>
-          <w:rFonts w:ascii="Arial" w:hAnsi="Arial" w:eastAsia="Arial" w:cs="Arial"/>
-          <w:color w:val="232323"/>
-          <w:sz w:val="20"/>
-          <w:szCs w:val="20"/>
-        </w:rPr>
-        <w:t>Served as Project Manager / Scrum Master, facilitating Agile ceremonies and managing end-to-end delivery for cross-functional product teams.</w:t>
-      </w:r>
-    </w:p>
-    <w:p>
-      <w:pPr>
-        <w:pStyle w:val="16"/>
-        <w:numPr>
-          <w:ilvl w:val="0"/>
-          <w:numId w:val="1"/>
-        </w:numPr>
-        <w:spacing w:after="40" w:line="250" w:lineRule="auto"/>
-        <w:jc w:val="both"/>
-      </w:pPr>
-      <w:r>
-        <w:rPr>
-          <w:rFonts w:ascii="Arial" w:hAnsi="Arial" w:eastAsia="Arial" w:cs="Arial"/>
-          <w:color w:val="232323"/>
-          <w:sz w:val="20"/>
-          <w:szCs w:val="20"/>
-        </w:rPr>
-        <w:t>Tracked velocity, cycle time, and lead time against quality and performance criteria; coached teams to higher levels of Scrum maturity at a sustainable, comfortable pace.</w:t>
-      </w:r>
-    </w:p>
-    <w:p>
-      <w:pPr>
-        <w:pStyle w:val="16"/>
-        <w:numPr>
-          <w:ilvl w:val="0"/>
-          <w:numId w:val="1"/>
-        </w:numPr>
-        <w:spacing w:after="40" w:line="250" w:lineRule="auto"/>
-        <w:jc w:val="both"/>
-      </w:pPr>
-      <w:r>
-        <w:rPr>
-          <w:rFonts w:ascii="Arial" w:hAnsi="Arial" w:eastAsia="Arial" w:cs="Arial"/>
-          <w:color w:val="232323"/>
-          <w:sz w:val="20"/>
-          <w:szCs w:val="20"/>
-        </w:rPr>
-        <w:t>Managed risk, issue, and dependency logs; partnered with Product Owners to refine and prioritise the backlog.</w:t>
-      </w:r>
-    </w:p>
-    <w:p>
-      <w:pPr>
-        <w:pStyle w:val="16"/>
-        <w:numPr>
-          <w:ilvl w:val="0"/>
-          <w:numId w:val="1"/>
-        </w:numPr>
-        <w:spacing w:after="40" w:line="250" w:lineRule="auto"/>
-        <w:jc w:val="both"/>
-      </w:pPr>
-      <w:r>
-        <w:rPr>
-          <w:rFonts w:ascii="Arial" w:hAnsi="Arial" w:eastAsia="Arial" w:cs="Arial"/>
-          <w:color w:val="232323"/>
-          <w:sz w:val="20"/>
-          <w:szCs w:val="20"/>
-        </w:rPr>
-        <w:t>Drove stakeholder communication, status reporting, and process improvement initiatives, improving sprint delivery predictability by ~15%.</w:t>
-      </w:r>
-    </w:p>
-    <w:p>
-      <w:pPr>
-        <w:spacing w:before="140" w:after="20"/>
-      </w:pPr>
-      <w:r>
-        <w:rPr>
-          <w:rFonts w:ascii="Arial" w:hAnsi="Arial" w:eastAsia="Arial" w:cs="Arial"/>
-          <w:b/>
-          <w:bCs/>
-          <w:color w:val="232323"/>
-          <w:sz w:val="22"/>
-          <w:szCs w:val="22"/>
-        </w:rPr>
-        <w:t>LID&amp;EW – GoK</w:t>
-      </w:r>
-    </w:p>
-    <w:p>
-      <w:pPr>
-        <w:tabs>
-          <w:tab w:val="right" w:pos="10178"/>
-        </w:tabs>
-        <w:spacing w:after="80"/>
-      </w:pPr>
-      <w:r>
-        <w:rPr>
           <w:rFonts w:hint="default" w:ascii="Arial" w:hAnsi="Arial" w:eastAsia="Arial" w:cs="Arial"/>
           <w:i/>
           <w:iCs/>
@@ -2061,6 +1451,17 @@
           <w:szCs w:val="21"/>
           <w:lang w:val="en-US"/>
         </w:rPr>
+        <w:t>Sr.</w:t>
+      </w:r>
+      <w:r>
+        <w:rPr>
+          <w:rFonts w:ascii="Arial" w:hAnsi="Arial" w:eastAsia="Arial" w:cs="Arial"/>
+          <w:i/>
+          <w:iCs/>
+          <w:color w:val="1F4E79"/>
+          <w:sz w:val="21"/>
+          <w:szCs w:val="21"/>
+        </w:rPr>
         <w:t>Scrum Master</w:t>
       </w:r>
       <w:r>
@@ -2071,87 +1472,309 @@
           <w:szCs w:val="18"/>
         </w:rPr>
         <w:tab/>
-        <w:t>Sep 2019 – May 2022</w:t>
-      </w:r>
-    </w:p>
-    <w:p>
-      <w:pPr>
-        <w:pStyle w:val="16"/>
-        <w:numPr>
-          <w:ilvl w:val="0"/>
-          <w:numId w:val="1"/>
-        </w:numPr>
-        <w:spacing w:after="40" w:line="250" w:lineRule="auto"/>
-        <w:jc w:val="both"/>
-      </w:pPr>
-      <w:r>
-        <w:rPr>
-          <w:rFonts w:ascii="Arial" w:hAnsi="Arial" w:eastAsia="Arial" w:cs="Arial"/>
-          <w:color w:val="232323"/>
-          <w:sz w:val="20"/>
-          <w:szCs w:val="20"/>
-        </w:rPr>
-        <w:t>Led end-to-end delivery of technology initiatives, managing scope, schedule, budget, and stakeholder expectations across multi-team programs.</w:t>
-      </w:r>
-    </w:p>
-    <w:p>
-      <w:pPr>
-        <w:pStyle w:val="16"/>
-        <w:numPr>
-          <w:ilvl w:val="0"/>
-          <w:numId w:val="1"/>
-        </w:numPr>
-        <w:spacing w:after="40" w:line="250" w:lineRule="auto"/>
-        <w:jc w:val="both"/>
-      </w:pPr>
-      <w:r>
-        <w:rPr>
-          <w:rFonts w:ascii="Arial" w:hAnsi="Arial" w:eastAsia="Arial" w:cs="Arial"/>
-          <w:color w:val="232323"/>
-          <w:sz w:val="20"/>
-          <w:szCs w:val="20"/>
-        </w:rPr>
-        <w:t>Owned risk, issue, and dependency management; facilitated structured project governance and steering committee reporting.</w:t>
-      </w:r>
-    </w:p>
-    <w:p>
-      <w:pPr>
-        <w:pStyle w:val="16"/>
-        <w:numPr>
-          <w:ilvl w:val="0"/>
-          <w:numId w:val="1"/>
-        </w:numPr>
-        <w:spacing w:after="40" w:line="250" w:lineRule="auto"/>
-        <w:jc w:val="both"/>
-      </w:pPr>
-      <w:r>
-        <w:rPr>
-          <w:rFonts w:ascii="Arial" w:hAnsi="Arial" w:eastAsia="Arial" w:cs="Arial"/>
-          <w:color w:val="232323"/>
-          <w:sz w:val="20"/>
-          <w:szCs w:val="20"/>
-        </w:rPr>
-        <w:t>Drove requirements gathering, planning, and milestone tracking in coordination with business and technical stakeholders.</w:t>
-      </w:r>
-    </w:p>
-    <w:p>
-      <w:pPr>
-        <w:pStyle w:val="16"/>
-        <w:numPr>
-          <w:ilvl w:val="0"/>
-          <w:numId w:val="1"/>
-        </w:numPr>
-        <w:spacing w:after="40" w:line="250" w:lineRule="auto"/>
-        <w:jc w:val="both"/>
-      </w:pPr>
-      <w:r>
-        <w:rPr>
-          <w:rFonts w:ascii="Arial" w:hAnsi="Arial" w:eastAsia="Arial" w:cs="Arial"/>
-          <w:color w:val="232323"/>
-          <w:sz w:val="20"/>
-          <w:szCs w:val="20"/>
-        </w:rPr>
-        <w:t>Implemented process and quality improvements that strengthened delivery consistency across the program.</w:t>
+      </w:r>
+      <w:r>
+        <w:rPr>
+          <w:rFonts w:ascii="Arial" w:hAnsi="Arial" w:eastAsia="Arial" w:cs="Arial"/>
+          <w:color w:val="6B7280"/>
+          <w:sz w:val="18"/>
+          <w:szCs w:val="18"/>
+        </w:rPr>
+        <w:t>Apr 2024 – Present</w:t>
+      </w:r>
+    </w:p>
+    <w:p>
+      <w:pPr>
+        <w:pStyle w:val="16"/>
+        <w:numPr>
+          <w:ilvl w:val="0"/>
+          <w:numId w:val="1"/>
+        </w:numPr>
+        <w:spacing w:after="40" w:line="250" w:lineRule="auto"/>
+        <w:jc w:val="both"/>
+      </w:pPr>
+      <w:r>
+        <w:rPr>
+          <w:rFonts w:ascii="Arial" w:hAnsi="Arial" w:eastAsia="Arial" w:cs="Arial"/>
+          <w:color w:val="232323"/>
+          <w:sz w:val="20"/>
+          <w:szCs w:val="20"/>
+        </w:rPr>
+        <w:t>Operating as Agile Delivery Lead / Scrum Master on Allianz’s financial services digital transformation initiatives — first the Motor Retail application development program, currently Motor Renewals — owning end-to-end delivery across planning, execution, and release, and coaching teams toward self-organization and customer satisfaction.</w:t>
+      </w:r>
+    </w:p>
+    <w:p>
+      <w:pPr>
+        <w:pStyle w:val="16"/>
+        <w:numPr>
+          <w:ilvl w:val="0"/>
+          <w:numId w:val="1"/>
+        </w:numPr>
+        <w:spacing w:after="40" w:line="250" w:lineRule="auto"/>
+        <w:jc w:val="both"/>
+      </w:pPr>
+      <w:r>
+        <w:rPr>
+          <w:rFonts w:ascii="Arial" w:hAnsi="Arial" w:eastAsia="Arial" w:cs="Arial"/>
+          <w:color w:val="232323"/>
+          <w:sz w:val="20"/>
+          <w:szCs w:val="20"/>
+        </w:rPr>
+        <w:t>Facilitate the full Agile ceremony cadence within a SAFe (Scaled Agile Framework) environment — including PI Planning, sprint planning, daily stand-ups, backlog refinement, sprint reviews, and retrospectives — in close coordination with Release Train Engineers, driving consistent, predictable delivery of business value.</w:t>
+      </w:r>
+    </w:p>
+    <w:p>
+      <w:pPr>
+        <w:pStyle w:val="16"/>
+        <w:numPr>
+          <w:ilvl w:val="0"/>
+          <w:numId w:val="1"/>
+        </w:numPr>
+        <w:spacing w:after="40" w:line="250" w:lineRule="auto"/>
+        <w:jc w:val="both"/>
+      </w:pPr>
+      <w:r>
+        <w:rPr>
+          <w:rFonts w:ascii="Arial" w:hAnsi="Arial" w:eastAsia="Arial" w:cs="Arial"/>
+          <w:color w:val="232323"/>
+          <w:sz w:val="20"/>
+          <w:szCs w:val="20"/>
+        </w:rPr>
+        <w:t>Coach teams and stakeholders on Agile principles, Scrum practices, and continuous improvement, strengthening engineering maturity and delivery capability.</w:t>
+      </w:r>
+    </w:p>
+    <w:p>
+      <w:pPr>
+        <w:pStyle w:val="16"/>
+        <w:numPr>
+          <w:ilvl w:val="0"/>
+          <w:numId w:val="1"/>
+        </w:numPr>
+        <w:spacing w:after="40" w:line="250" w:lineRule="auto"/>
+        <w:jc w:val="both"/>
+      </w:pPr>
+      <w:r>
+        <w:t xml:space="preserve">Facilitate Agile ceremonies and support effective Scrum practices </w:t>
+      </w:r>
+    </w:p>
+    <w:p>
+      <w:pPr>
+        <w:pStyle w:val="16"/>
+        <w:numPr>
+          <w:ilvl w:val="0"/>
+          <w:numId w:val="1"/>
+        </w:numPr>
+        <w:spacing w:after="40" w:line="250" w:lineRule="auto"/>
+        <w:jc w:val="both"/>
+      </w:pPr>
+      <w:r>
+        <w:rPr>
+          <w:rFonts w:ascii="Arial" w:hAnsi="Arial" w:eastAsia="Arial" w:cs="Arial"/>
+          <w:color w:val="232323"/>
+          <w:sz w:val="20"/>
+          <w:szCs w:val="20"/>
+        </w:rPr>
+        <w:t>Own risk, assumption, issue, and dependency (RAID) management; proactively remove impediments, manage delivery risks and dependencies, and handle escalations to maintain optimal team flow.</w:t>
+      </w:r>
+    </w:p>
+    <w:p>
+      <w:pPr>
+        <w:pStyle w:val="16"/>
+        <w:numPr>
+          <w:ilvl w:val="0"/>
+          <w:numId w:val="1"/>
+        </w:numPr>
+        <w:spacing w:after="40" w:line="250" w:lineRule="auto"/>
+        <w:jc w:val="both"/>
+      </w:pPr>
+      <w:r>
+        <w:rPr>
+          <w:rFonts w:ascii="Arial" w:hAnsi="Arial" w:eastAsia="Arial" w:cs="Arial"/>
+          <w:color w:val="232323"/>
+          <w:sz w:val="20"/>
+          <w:szCs w:val="20"/>
+        </w:rPr>
+        <w:t>Partner with Product Owners, Business Analysts, Development, and QA teams on requirements gathering, backlog grooming, sprint commitment, and backlog prioritization; create and maintain delivery roadmaps and milestone plans.</w:t>
+      </w:r>
+    </w:p>
+    <w:p>
+      <w:pPr>
+        <w:pStyle w:val="16"/>
+        <w:numPr>
+          <w:ilvl w:val="0"/>
+          <w:numId w:val="1"/>
+        </w:numPr>
+        <w:spacing w:after="40" w:line="250" w:lineRule="auto"/>
+        <w:jc w:val="both"/>
+      </w:pPr>
+      <w:r>
+        <w:rPr>
+          <w:rFonts w:ascii="Arial" w:hAnsi="Arial" w:eastAsia="Arial" w:cs="Arial"/>
+          <w:color w:val="232323"/>
+          <w:sz w:val="20"/>
+          <w:szCs w:val="20"/>
+        </w:rPr>
+        <w:t>Track Agile metrics — velocity, sprint burndown, and team performance — via JIRA dashboards, promoting accountability, transparency, and self-organization across the team.</w:t>
+      </w:r>
+    </w:p>
+    <w:p>
+      <w:pPr>
+        <w:pStyle w:val="16"/>
+        <w:numPr>
+          <w:ilvl w:val="0"/>
+          <w:numId w:val="1"/>
+        </w:numPr>
+        <w:spacing w:after="40" w:line="250" w:lineRule="auto"/>
+        <w:jc w:val="both"/>
+      </w:pPr>
+      <w:r>
+        <w:rPr>
+          <w:rFonts w:ascii="Arial" w:hAnsi="Arial" w:eastAsia="Arial" w:cs="Arial"/>
+          <w:color w:val="232323"/>
+          <w:sz w:val="20"/>
+          <w:szCs w:val="20"/>
+        </w:rPr>
+        <w:t>Designed and deployed the Motor Renewals AI Agent (Claude LLMs) for automated bug analysis, requirements querying, and case support.</w:t>
+      </w:r>
+    </w:p>
+    <w:p>
+      <w:pPr>
+        <w:pStyle w:val="16"/>
+        <w:numPr>
+          <w:ilvl w:val="0"/>
+          <w:numId w:val="1"/>
+        </w:numPr>
+        <w:spacing w:after="40" w:line="250" w:lineRule="auto"/>
+        <w:jc w:val="both"/>
+      </w:pPr>
+      <w:r>
+        <w:rPr>
+          <w:rFonts w:ascii="Arial" w:hAnsi="Arial" w:eastAsia="Arial" w:cs="Arial"/>
+          <w:color w:val="232323"/>
+          <w:sz w:val="20"/>
+          <w:szCs w:val="20"/>
+        </w:rPr>
+        <w:t>Automated leave and timesheet reminders for the team, cutting manual follow-up effort by ~80% and improving on-time compliance by ~25%.</w:t>
+      </w:r>
+    </w:p>
+    <w:p>
+      <w:pPr>
+        <w:pStyle w:val="16"/>
+        <w:numPr>
+          <w:ilvl w:val="0"/>
+          <w:numId w:val="1"/>
+        </w:numPr>
+        <w:spacing w:after="40" w:line="250" w:lineRule="auto"/>
+        <w:jc w:val="both"/>
+      </w:pPr>
+      <w:r>
+        <w:rPr>
+          <w:rFonts w:ascii="Arial" w:hAnsi="Arial" w:eastAsia="Arial" w:cs="Arial"/>
+          <w:color w:val="232323"/>
+          <w:sz w:val="20"/>
+          <w:szCs w:val="20"/>
+        </w:rPr>
+        <w:t>Automated retrospective survey forms, increasing team participation in retrospectives by ~30% while reducing administrative overhead.</w:t>
+      </w:r>
+    </w:p>
+    <w:p>
+      <w:pPr>
+        <w:pStyle w:val="16"/>
+        <w:numPr>
+          <w:ilvl w:val="0"/>
+          <w:numId w:val="1"/>
+        </w:numPr>
+        <w:spacing w:after="40" w:line="250" w:lineRule="auto"/>
+        <w:jc w:val="both"/>
+      </w:pPr>
+      <w:r>
+        <w:rPr>
+          <w:rFonts w:ascii="Arial" w:hAnsi="Arial" w:eastAsia="Arial" w:cs="Arial"/>
+          <w:color w:val="232323"/>
+          <w:sz w:val="20"/>
+          <w:szCs w:val="20"/>
+        </w:rPr>
+        <w:t>Built ReportPilot, a Claude Code-developed Python tool automating program status reporting via the Jira REST API.</w:t>
+      </w:r>
+    </w:p>
+    <w:p>
+      <w:pPr>
+        <w:pStyle w:val="16"/>
+        <w:numPr>
+          <w:ilvl w:val="0"/>
+          <w:numId w:val="1"/>
+        </w:numPr>
+        <w:spacing w:after="40" w:line="250" w:lineRule="auto"/>
+        <w:jc w:val="both"/>
+      </w:pPr>
+      <w:r>
+        <w:rPr>
+          <w:rFonts w:ascii="Arial" w:hAnsi="Arial" w:eastAsia="Arial" w:cs="Arial"/>
+          <w:color w:val="232323"/>
+          <w:sz w:val="20"/>
+          <w:szCs w:val="20"/>
+        </w:rPr>
+        <w:t>Led enterprise-scale Claude AI agent adoption across a 40-member, five-team program, driving strong adoption and measurable delivery gains.</w:t>
+      </w:r>
+    </w:p>
+    <w:p>
+      <w:pPr>
+        <w:pStyle w:val="16"/>
+        <w:numPr>
+          <w:ilvl w:val="0"/>
+          <w:numId w:val="1"/>
+        </w:numPr>
+        <w:spacing w:after="40" w:line="250" w:lineRule="auto"/>
+        <w:jc w:val="both"/>
+      </w:pPr>
+      <w:r>
+        <w:rPr>
+          <w:rFonts w:ascii="Arial" w:hAnsi="Arial" w:eastAsia="Arial" w:cs="Arial"/>
+          <w:color w:val="232323"/>
+          <w:sz w:val="20"/>
+          <w:szCs w:val="20"/>
+        </w:rPr>
+        <w:t>Own JIRA dashboard design and JIRA automation, and enforce Acceptance Criteria / Definition of Done compliance across all team deliverables.</w:t>
+      </w:r>
+    </w:p>
+    <w:p>
+      <w:pPr>
+        <w:pStyle w:val="16"/>
+        <w:numPr>
+          <w:ilvl w:val="0"/>
+          <w:numId w:val="1"/>
+        </w:numPr>
+        <w:spacing w:after="40" w:line="250" w:lineRule="auto"/>
+        <w:jc w:val="both"/>
+      </w:pPr>
+      <w:r>
+        <w:rPr>
+          <w:rFonts w:ascii="Arial" w:hAnsi="Arial" w:eastAsia="Arial" w:cs="Arial"/>
+          <w:color w:val="232323"/>
+          <w:sz w:val="20"/>
+          <w:szCs w:val="20"/>
+        </w:rPr>
+        <w:t>Lead the team handling production support, ensuring incidents are logged and tracked in ServiceNow, and liaising with business stakeholders to resolve developer and QA queries on open incidents.</w:t>
+      </w:r>
+    </w:p>
+    <w:p>
+      <w:pPr>
+        <w:pStyle w:val="16"/>
+        <w:numPr>
+          <w:ilvl w:val="0"/>
+          <w:numId w:val="1"/>
+        </w:numPr>
+        <w:spacing w:after="40" w:line="250" w:lineRule="auto"/>
+        <w:jc w:val="both"/>
+      </w:pPr>
+      <w:r>
+        <w:rPr>
+          <w:rFonts w:ascii="Arial" w:hAnsi="Arial" w:eastAsia="Arial" w:cs="Arial"/>
+          <w:color w:val="232323"/>
+          <w:sz w:val="20"/>
+          <w:szCs w:val="20"/>
+        </w:rPr>
+        <w:t>Built ServiceNow incident dashboards — including one developed using Claude — to give leadership real-time visibility into incident volume, status, and trends.</w:t>
       </w:r>
     </w:p>
     <w:p>
@@ -2167,7 +1790,7 @@
           <w:sz w:val="22"/>
           <w:szCs w:val="22"/>
         </w:rPr>
-        <w:t>UST Global</w:t>
+        <w:t>Indium Software</w:t>
       </w:r>
     </w:p>
     <w:p>
@@ -2187,7 +1810,7 @@
           <w:szCs w:val="21"/>
           <w:lang w:val="en-US"/>
         </w:rPr>
-        <w:t>Lead</w:t>
+        <w:t>Sr.</w:t>
       </w:r>
       <w:r>
         <w:rPr>
@@ -2198,7 +1821,19 @@
           <w:sz w:val="21"/>
           <w:szCs w:val="21"/>
         </w:rPr>
-        <w:t>– Projects (QA &amp; Agile Delivery)</w:t>
+        <w:t>Scrum Master</w:t>
+      </w:r>
+      <w:r>
+        <w:rPr>
+          <w:rFonts w:hint="default" w:ascii="Arial" w:hAnsi="Arial" w:eastAsia="Arial" w:cs="Arial"/>
+          <w:i/>
+          <w:iCs/>
+          <w:color w:val="1F4E79"/>
+          <w:sz w:val="21"/>
+          <w:szCs w:val="21"/>
+          <w:lang w:val="en-US"/>
+        </w:rPr>
+        <w:t>/Agile delivery</w:t>
       </w:r>
       <w:r>
         <w:rPr>
@@ -2208,6 +1843,374 @@
           <w:szCs w:val="18"/>
         </w:rPr>
         <w:tab/>
+      </w:r>
+      <w:r>
+        <w:rPr>
+          <w:rFonts w:ascii="Arial" w:hAnsi="Arial" w:eastAsia="Arial" w:cs="Arial"/>
+          <w:color w:val="6B7280"/>
+          <w:sz w:val="18"/>
+          <w:szCs w:val="18"/>
+        </w:rPr>
+        <w:t>Dec 2022 – Nov 2023</w:t>
+      </w:r>
+    </w:p>
+    <w:p>
+      <w:pPr>
+        <w:pStyle w:val="16"/>
+        <w:numPr>
+          <w:ilvl w:val="0"/>
+          <w:numId w:val="1"/>
+        </w:numPr>
+        <w:spacing w:after="40" w:line="250" w:lineRule="auto"/>
+        <w:jc w:val="both"/>
+      </w:pPr>
+      <w:r>
+        <w:rPr>
+          <w:rFonts w:ascii="Arial" w:hAnsi="Arial" w:eastAsia="Arial" w:cs="Arial"/>
+          <w:color w:val="232323"/>
+          <w:sz w:val="20"/>
+          <w:szCs w:val="20"/>
+        </w:rPr>
+        <w:t>Served as Project Manager / Scrum Master, facilitating Agile ceremonies and managing end-to-end delivery for cross-functional product teams.</w:t>
+      </w:r>
+    </w:p>
+    <w:p>
+      <w:pPr>
+        <w:pStyle w:val="16"/>
+        <w:numPr>
+          <w:ilvl w:val="0"/>
+          <w:numId w:val="1"/>
+        </w:numPr>
+        <w:spacing w:after="40" w:line="250" w:lineRule="auto"/>
+        <w:jc w:val="both"/>
+      </w:pPr>
+      <w:r>
+        <w:rPr>
+          <w:rFonts w:ascii="Arial" w:hAnsi="Arial" w:eastAsia="Arial" w:cs="Arial"/>
+          <w:color w:val="232323"/>
+          <w:sz w:val="20"/>
+          <w:szCs w:val="20"/>
+        </w:rPr>
+        <w:t>Tracked velocity against quality and performance criteria; coached teams to higher levels of Scrum maturity at a sustainable, comfortable pace.</w:t>
+      </w:r>
+    </w:p>
+    <w:p>
+      <w:pPr>
+        <w:pStyle w:val="16"/>
+        <w:numPr>
+          <w:ilvl w:val="0"/>
+          <w:numId w:val="1"/>
+        </w:numPr>
+        <w:spacing w:after="40" w:line="250" w:lineRule="auto"/>
+        <w:jc w:val="both"/>
+      </w:pPr>
+      <w:r>
+        <w:t xml:space="preserve">Facilitate Agile ceremonies and support effective Scrum practices </w:t>
+      </w:r>
+    </w:p>
+    <w:p>
+      <w:pPr>
+        <w:pStyle w:val="16"/>
+        <w:numPr>
+          <w:ilvl w:val="0"/>
+          <w:numId w:val="1"/>
+        </w:numPr>
+        <w:spacing w:after="40" w:line="250" w:lineRule="auto"/>
+        <w:jc w:val="both"/>
+      </w:pPr>
+      <w:r>
+        <w:t xml:space="preserve"> Identif</w:t>
+      </w:r>
+      <w:r>
+        <w:rPr>
+          <w:rFonts w:hint="default"/>
+          <w:lang w:val="en-US"/>
+        </w:rPr>
+        <w:t>ied</w:t>
+      </w:r>
+      <w:r>
+        <w:t xml:space="preserve"> and remove impediments impacting team delivery </w:t>
+      </w:r>
+    </w:p>
+    <w:p>
+      <w:pPr>
+        <w:pStyle w:val="16"/>
+        <w:numPr>
+          <w:ilvl w:val="0"/>
+          <w:numId w:val="1"/>
+        </w:numPr>
+        <w:spacing w:after="40" w:line="250" w:lineRule="auto"/>
+        <w:jc w:val="both"/>
+      </w:pPr>
+      <w:r>
+        <w:t xml:space="preserve"> Coordinate</w:t>
+      </w:r>
+      <w:r>
+        <w:rPr>
+          <w:rFonts w:hint="default"/>
+          <w:lang w:val="en-US"/>
+        </w:rPr>
+        <w:t>d</w:t>
+      </w:r>
+      <w:r>
+        <w:t xml:space="preserve"> with teams and stakeholders </w:t>
+      </w:r>
+    </w:p>
+    <w:p>
+      <w:pPr>
+        <w:pStyle w:val="16"/>
+        <w:numPr>
+          <w:ilvl w:val="0"/>
+          <w:numId w:val="1"/>
+        </w:numPr>
+        <w:spacing w:after="40" w:line="250" w:lineRule="auto"/>
+        <w:jc w:val="both"/>
+      </w:pPr>
+      <w:r>
+        <w:rPr>
+          <w:rFonts w:ascii="Arial" w:hAnsi="Arial" w:eastAsia="Arial" w:cs="Arial"/>
+          <w:color w:val="232323"/>
+          <w:sz w:val="20"/>
+          <w:szCs w:val="20"/>
+        </w:rPr>
+        <w:t>Managed risk, issue, and dependency logs; partnered with Product Owners to refine and prioritise the backlog.</w:t>
+      </w:r>
+    </w:p>
+    <w:p>
+      <w:pPr>
+        <w:pStyle w:val="16"/>
+        <w:numPr>
+          <w:ilvl w:val="0"/>
+          <w:numId w:val="1"/>
+        </w:numPr>
+        <w:spacing w:after="40" w:line="250" w:lineRule="auto"/>
+        <w:jc w:val="both"/>
+      </w:pPr>
+      <w:r>
+        <w:rPr>
+          <w:rFonts w:ascii="Arial" w:hAnsi="Arial" w:eastAsia="Arial" w:cs="Arial"/>
+          <w:color w:val="232323"/>
+          <w:sz w:val="20"/>
+          <w:szCs w:val="20"/>
+        </w:rPr>
+        <w:t>Drove stakeholder communication, status reporting, and process improvement initiatives, improving sprint delivery predictability by ~15%.</w:t>
+      </w:r>
+    </w:p>
+    <w:p>
+      <w:pPr>
+        <w:spacing w:before="140" w:after="20"/>
+      </w:pPr>
+      <w:r>
+        <w:rPr>
+          <w:rFonts w:ascii="Arial" w:hAnsi="Arial" w:eastAsia="Arial" w:cs="Arial"/>
+          <w:b/>
+          <w:bCs/>
+          <w:color w:val="232323"/>
+          <w:sz w:val="22"/>
+          <w:szCs w:val="22"/>
+        </w:rPr>
+        <w:t>LID&amp;EW – GoK</w:t>
+      </w:r>
+    </w:p>
+    <w:p>
+      <w:pPr>
+        <w:tabs>
+          <w:tab w:val="right" w:pos="10178"/>
+        </w:tabs>
+        <w:spacing w:after="80"/>
+      </w:pPr>
+      <w:r>
+        <w:rPr>
+          <w:rFonts w:hint="default" w:ascii="Arial" w:hAnsi="Arial" w:eastAsia="Arial" w:cs="Arial"/>
+          <w:i/>
+          <w:iCs/>
+          <w:color w:val="1F4E79"/>
+          <w:sz w:val="21"/>
+          <w:szCs w:val="21"/>
+          <w:lang w:val="en-US"/>
+        </w:rPr>
+        <w:t>Scrum Master</w:t>
+      </w:r>
+      <w:r>
+        <w:rPr>
+          <w:rFonts w:ascii="Arial" w:hAnsi="Arial" w:eastAsia="Arial" w:cs="Arial"/>
+          <w:color w:val="6B7280"/>
+          <w:sz w:val="18"/>
+          <w:szCs w:val="18"/>
+        </w:rPr>
+        <w:tab/>
+      </w:r>
+      <w:r>
+        <w:rPr>
+          <w:rFonts w:ascii="Arial" w:hAnsi="Arial" w:eastAsia="Arial" w:cs="Arial"/>
+          <w:color w:val="6B7280"/>
+          <w:sz w:val="18"/>
+          <w:szCs w:val="18"/>
+        </w:rPr>
+        <w:t xml:space="preserve">Sep 2019 – </w:t>
+      </w:r>
+      <w:r>
+        <w:rPr>
+          <w:rFonts w:hint="default" w:ascii="Arial" w:hAnsi="Arial" w:eastAsia="Arial" w:cs="Arial"/>
+          <w:color w:val="6B7280"/>
+          <w:sz w:val="18"/>
+          <w:szCs w:val="18"/>
+          <w:lang w:val="en-US"/>
+        </w:rPr>
+        <w:t xml:space="preserve">Dec </w:t>
+      </w:r>
+      <w:r>
+        <w:rPr>
+          <w:rFonts w:ascii="Arial" w:hAnsi="Arial" w:eastAsia="Arial" w:cs="Arial"/>
+          <w:color w:val="6B7280"/>
+          <w:sz w:val="18"/>
+          <w:szCs w:val="18"/>
+        </w:rPr>
+        <w:t>2022</w:t>
+      </w:r>
+    </w:p>
+    <w:p>
+      <w:pPr>
+        <w:pStyle w:val="16"/>
+        <w:numPr>
+          <w:ilvl w:val="0"/>
+          <w:numId w:val="1"/>
+        </w:numPr>
+        <w:spacing w:after="40" w:line="250" w:lineRule="auto"/>
+        <w:jc w:val="both"/>
+      </w:pPr>
+      <w:r>
+        <w:rPr>
+          <w:rFonts w:ascii="Arial" w:hAnsi="Arial" w:eastAsia="Arial" w:cs="Arial"/>
+          <w:color w:val="232323"/>
+          <w:sz w:val="20"/>
+          <w:szCs w:val="20"/>
+        </w:rPr>
+        <w:t>Led end-to-end delivery of technology initiatives, managing scope, schedule, budget, and stakeholder expectations across multi-team programs.</w:t>
+      </w:r>
+    </w:p>
+    <w:p>
+      <w:pPr>
+        <w:pStyle w:val="16"/>
+        <w:numPr>
+          <w:ilvl w:val="0"/>
+          <w:numId w:val="1"/>
+        </w:numPr>
+        <w:spacing w:after="40" w:line="250" w:lineRule="auto"/>
+        <w:jc w:val="both"/>
+      </w:pPr>
+      <w:r>
+        <w:rPr>
+          <w:rFonts w:ascii="Arial" w:hAnsi="Arial" w:eastAsia="Arial" w:cs="Arial"/>
+          <w:color w:val="232323"/>
+          <w:sz w:val="20"/>
+          <w:szCs w:val="20"/>
+        </w:rPr>
+        <w:t>Owned risk, issue, and dependency management; facilitated structured project governance and steering committee reporting.</w:t>
+      </w:r>
+    </w:p>
+    <w:p>
+      <w:pPr>
+        <w:pStyle w:val="16"/>
+        <w:numPr>
+          <w:ilvl w:val="0"/>
+          <w:numId w:val="1"/>
+        </w:numPr>
+        <w:spacing w:after="40" w:line="250" w:lineRule="auto"/>
+        <w:jc w:val="both"/>
+      </w:pPr>
+      <w:r>
+        <w:rPr>
+          <w:rFonts w:ascii="Arial" w:hAnsi="Arial" w:eastAsia="Arial" w:cs="Arial"/>
+          <w:color w:val="232323"/>
+          <w:sz w:val="20"/>
+          <w:szCs w:val="20"/>
+        </w:rPr>
+        <w:t>Drove requirements gathering, planning, and milestone tracking in coordination with business and technical stakeholders.</w:t>
+      </w:r>
+    </w:p>
+    <w:p>
+      <w:pPr>
+        <w:pStyle w:val="16"/>
+        <w:numPr>
+          <w:ilvl w:val="0"/>
+          <w:numId w:val="1"/>
+        </w:numPr>
+        <w:spacing w:after="40" w:line="250" w:lineRule="auto"/>
+        <w:jc w:val="both"/>
+      </w:pPr>
+      <w:r>
+        <w:rPr>
+          <w:rFonts w:ascii="Arial" w:hAnsi="Arial" w:eastAsia="Arial" w:cs="Arial"/>
+          <w:color w:val="232323"/>
+          <w:sz w:val="20"/>
+          <w:szCs w:val="20"/>
+        </w:rPr>
+        <w:t>Implemented process and quality improvements that strengthened delivery consistency across the program.</w:t>
+      </w:r>
+    </w:p>
+    <w:p>
+      <w:pPr>
+        <w:spacing w:before="140" w:after="20"/>
+      </w:pPr>
+      <w:r>
+        <w:rPr>
+          <w:rFonts w:ascii="Arial" w:hAnsi="Arial" w:eastAsia="Arial" w:cs="Arial"/>
+          <w:b/>
+          <w:bCs/>
+          <w:color w:val="232323"/>
+          <w:sz w:val="22"/>
+          <w:szCs w:val="22"/>
+        </w:rPr>
+        <w:t>UST Global</w:t>
+      </w:r>
+    </w:p>
+    <w:p>
+      <w:pPr>
+        <w:tabs>
+          <w:tab w:val="right" w:pos="10178"/>
+        </w:tabs>
+        <w:spacing w:after="80"/>
+      </w:pPr>
+      <w:r>
+        <w:rPr>
+          <w:rFonts w:hint="default" w:ascii="Arial" w:hAnsi="Arial" w:eastAsia="Arial" w:cs="Arial"/>
+          <w:i/>
+          <w:iCs/>
+          <w:color w:val="1F4E79"/>
+          <w:sz w:val="21"/>
+          <w:szCs w:val="21"/>
+          <w:lang w:val="en-US"/>
+        </w:rPr>
+        <w:t>Lead</w:t>
+      </w:r>
+      <w:r>
+        <w:rPr>
+          <w:rFonts w:ascii="Arial" w:hAnsi="Arial" w:eastAsia="Arial" w:cs="Arial"/>
+          <w:i/>
+          <w:iCs/>
+          <w:color w:val="1F4E79"/>
+          <w:sz w:val="21"/>
+          <w:szCs w:val="21"/>
+        </w:rPr>
+        <w:t>– Projects (QA &amp; Agile Delivery)</w:t>
+      </w:r>
+      <w:r>
+        <w:rPr>
+          <w:rFonts w:ascii="Arial" w:hAnsi="Arial" w:eastAsia="Arial" w:cs="Arial"/>
+          <w:color w:val="6B7280"/>
+          <w:sz w:val="18"/>
+          <w:szCs w:val="18"/>
+        </w:rPr>
+        <w:tab/>
+      </w:r>
+      <w:r>
+        <w:rPr>
+          <w:rFonts w:ascii="Arial" w:hAnsi="Arial" w:eastAsia="Arial" w:cs="Arial"/>
+          <w:color w:val="6B7280"/>
+          <w:sz w:val="18"/>
+          <w:szCs w:val="18"/>
+        </w:rPr>
         <w:t>Jan 2018 – Sep 2019</w:t>
       </w:r>
     </w:p>
@@ -2344,99 +2347,7 @@
           <w:sz w:val="22"/>
           <w:szCs w:val="22"/>
         </w:rPr>
-        <w:t>Good Methods Global Pvt Ltd (now Carestack) – Consultant  |  Dec 2016 – Oct 2017</w:t>
-      </w:r>
-    </w:p>
-    <w:p>
-      <w:pPr>
-        <w:pStyle w:val="16"/>
-        <w:numPr>
-          <w:ilvl w:val="0"/>
-          <w:numId w:val="1"/>
-        </w:numPr>
-        <w:spacing w:after="40" w:line="250" w:lineRule="auto"/>
-        <w:jc w:val="both"/>
-      </w:pPr>
-      <w:r>
-        <w:rPr>
-          <w:rFonts w:ascii="Arial" w:hAnsi="Arial" w:eastAsia="Arial" w:cs="Arial"/>
-          <w:color w:val="232323"/>
-          <w:sz w:val="20"/>
-          <w:szCs w:val="20"/>
-        </w:rPr>
-        <w:t>Managed testing projects, overseeing test planning, execution, and defect management to ensure release quality.</w:t>
-      </w:r>
-    </w:p>
-    <w:p>
-      <w:pPr>
-        <w:pStyle w:val="16"/>
-        <w:numPr>
-          <w:ilvl w:val="0"/>
-          <w:numId w:val="1"/>
-        </w:numPr>
-        <w:spacing w:after="40" w:line="250" w:lineRule="auto"/>
-        <w:jc w:val="both"/>
-      </w:pPr>
-      <w:r>
-        <w:rPr>
-          <w:rFonts w:ascii="Arial" w:hAnsi="Arial" w:eastAsia="Arial" w:cs="Arial"/>
-          <w:color w:val="232323"/>
-          <w:sz w:val="20"/>
-          <w:szCs w:val="20"/>
-        </w:rPr>
-        <w:t>Supported project delivery and consulting engagements, contributing to planning, governance, and stakeholder reporting.</w:t>
-      </w:r>
-    </w:p>
-    <w:p>
-      <w:pPr>
-        <w:spacing w:before="140" w:after="20"/>
-      </w:pPr>
-      <w:r>
-        <w:rPr>
-          <w:rFonts w:ascii="Arial" w:hAnsi="Arial" w:eastAsia="Arial" w:cs="Arial"/>
-          <w:b/>
-          <w:bCs/>
-          <w:color w:val="232323"/>
-          <w:sz w:val="22"/>
-          <w:szCs w:val="22"/>
-        </w:rPr>
-        <w:t>Ernst &amp; Young – Project Lead  |  Apr 2014 – April 2016</w:t>
-      </w:r>
-    </w:p>
-    <w:p>
-      <w:pPr>
-        <w:pStyle w:val="16"/>
-        <w:numPr>
-          <w:ilvl w:val="0"/>
-          <w:numId w:val="1"/>
-        </w:numPr>
-        <w:spacing w:after="40" w:line="250" w:lineRule="auto"/>
-        <w:jc w:val="both"/>
-      </w:pPr>
-      <w:r>
-        <w:rPr>
-          <w:rFonts w:ascii="Arial" w:hAnsi="Arial" w:eastAsia="Arial" w:cs="Arial"/>
-          <w:color w:val="232323"/>
-          <w:sz w:val="20"/>
-          <w:szCs w:val="20"/>
-        </w:rPr>
-        <w:t>Led quality and delivery governance across enterprise software programs, supporting SDLC planning and release readiness.</w:t>
-      </w:r>
-    </w:p>
-    <w:p>
-      <w:pPr>
-        <w:spacing w:before="140" w:after="20"/>
-      </w:pPr>
-      <w:r>
-        <w:rPr>
-          <w:rFonts w:ascii="Arial" w:hAnsi="Arial" w:eastAsia="Arial" w:cs="Arial"/>
-          <w:b/>
-          <w:bCs/>
-          <w:color w:val="232323"/>
-          <w:sz w:val="22"/>
-          <w:szCs w:val="22"/>
-        </w:rPr>
-        <w:t xml:space="preserve">Cognizant Technology Solutions – </w:t>
+        <w:t xml:space="preserve">Good Methods Global Pvt Ltd (now Carestack) – </w:t>
       </w:r>
       <w:r>
         <w:rPr>
@@ -2448,7 +2359,7 @@
           <w:szCs w:val="22"/>
           <w:lang w:val="en-US"/>
         </w:rPr>
-        <w:t>Sr.Associate</w:t>
+        <w:t>QA Lead</w:t>
       </w:r>
       <w:r>
         <w:rPr>
@@ -2459,30 +2370,214 @@
           <w:sz w:val="22"/>
           <w:szCs w:val="22"/>
         </w:rPr>
-        <w:t>, Projects(QA)  |  Nov 2009 – Apr 2014</w:t>
-      </w:r>
-    </w:p>
-    <w:p>
-      <w:pPr>
-        <w:pStyle w:val="16"/>
-        <w:numPr>
-          <w:ilvl w:val="0"/>
-          <w:numId w:val="1"/>
-        </w:numPr>
-        <w:spacing w:after="40" w:line="250" w:lineRule="auto"/>
-        <w:jc w:val="both"/>
-      </w:pPr>
-      <w:r>
-        <w:rPr>
-          <w:rFonts w:ascii="Arial" w:hAnsi="Arial" w:eastAsia="Arial" w:cs="Arial"/>
-          <w:color w:val="232323"/>
-          <w:sz w:val="20"/>
-          <w:szCs w:val="20"/>
-        </w:rPr>
-        <w:t>Managed project delivery and client engagements across the software development lifecycle, building the foundation in IT project and program management.</w:t>
+        <w:t xml:space="preserve">  |  Dec 2016 – Oct 2017</w:t>
+      </w:r>
+    </w:p>
+    <w:p>
+      <w:pPr>
+        <w:pStyle w:val="16"/>
+        <w:numPr>
+          <w:ilvl w:val="0"/>
+          <w:numId w:val="1"/>
+        </w:numPr>
+        <w:spacing w:after="40" w:line="250" w:lineRule="auto"/>
+        <w:jc w:val="both"/>
+      </w:pPr>
+      <w:r>
+        <w:rPr>
+          <w:rFonts w:ascii="Arial" w:hAnsi="Arial" w:eastAsia="Arial" w:cs="Arial"/>
+          <w:color w:val="232323"/>
+          <w:sz w:val="20"/>
+          <w:szCs w:val="20"/>
+        </w:rPr>
+        <w:t>Managed testing projects, overseeing test planning, execution, and defect management to ensure release quality.</w:t>
+      </w:r>
+    </w:p>
+    <w:p>
+      <w:pPr>
+        <w:pStyle w:val="16"/>
+        <w:numPr>
+          <w:ilvl w:val="0"/>
+          <w:numId w:val="1"/>
+        </w:numPr>
+        <w:spacing w:after="40" w:line="250" w:lineRule="auto"/>
+        <w:jc w:val="both"/>
+      </w:pPr>
+      <w:r>
+        <w:rPr>
+          <w:rFonts w:ascii="Arial" w:hAnsi="Arial" w:eastAsia="Arial" w:cs="Arial"/>
+          <w:color w:val="232323"/>
+          <w:sz w:val="20"/>
+          <w:szCs w:val="20"/>
+        </w:rPr>
+        <w:t>Supported project delivery and consulting engagements, contributing to planning, governance, and stakeholder reporting.</w:t>
+      </w:r>
+    </w:p>
+    <w:p>
+      <w:pPr>
+        <w:spacing w:before="140" w:after="20"/>
+      </w:pPr>
+      <w:r>
+        <w:rPr>
+          <w:rFonts w:ascii="Arial" w:hAnsi="Arial" w:eastAsia="Arial" w:cs="Arial"/>
+          <w:b/>
+          <w:bCs/>
+          <w:color w:val="232323"/>
+          <w:sz w:val="22"/>
+          <w:szCs w:val="22"/>
+        </w:rPr>
+        <w:t>Ernst &amp; Young – Project Lead</w:t>
+      </w:r>
+      <w:r>
+        <w:rPr>
+          <w:rFonts w:hint="default" w:ascii="Arial" w:hAnsi="Arial" w:eastAsia="Arial" w:cs="Arial"/>
+          <w:b/>
+          <w:bCs/>
+          <w:color w:val="232323"/>
+          <w:sz w:val="22"/>
+          <w:szCs w:val="22"/>
+          <w:lang w:val="en-US"/>
+        </w:rPr>
+        <w:t>-QA</w:t>
+      </w:r>
+      <w:r>
+        <w:rPr>
+          <w:rFonts w:ascii="Arial" w:hAnsi="Arial" w:eastAsia="Arial" w:cs="Arial"/>
+          <w:b/>
+          <w:bCs/>
+          <w:color w:val="232323"/>
+          <w:sz w:val="22"/>
+          <w:szCs w:val="22"/>
+        </w:rPr>
+        <w:t xml:space="preserve">  |  Apr 2014 – </w:t>
+      </w:r>
+      <w:r>
+        <w:rPr>
+          <w:rFonts w:hint="default" w:ascii="Arial" w:hAnsi="Arial" w:eastAsia="Arial" w:cs="Arial"/>
+          <w:b/>
+          <w:bCs/>
+          <w:color w:val="232323"/>
+          <w:sz w:val="22"/>
+          <w:szCs w:val="22"/>
+          <w:lang w:val="en-US"/>
+        </w:rPr>
+        <w:t xml:space="preserve">Dec </w:t>
+      </w:r>
+      <w:r>
+        <w:rPr>
+          <w:rFonts w:ascii="Arial" w:hAnsi="Arial" w:eastAsia="Arial" w:cs="Arial"/>
+          <w:b/>
+          <w:bCs/>
+          <w:color w:val="232323"/>
+          <w:sz w:val="22"/>
+          <w:szCs w:val="22"/>
+        </w:rPr>
+        <w:t>2016</w:t>
+      </w:r>
+    </w:p>
+    <w:p>
+      <w:pPr>
+        <w:pStyle w:val="16"/>
+        <w:numPr>
+          <w:ilvl w:val="0"/>
+          <w:numId w:val="1"/>
+        </w:numPr>
+        <w:spacing w:after="40" w:line="250" w:lineRule="auto"/>
+        <w:jc w:val="both"/>
+      </w:pPr>
+      <w:r>
+        <w:rPr>
+          <w:rFonts w:ascii="Arial" w:hAnsi="Arial" w:eastAsia="Arial" w:cs="Arial"/>
+          <w:color w:val="232323"/>
+          <w:sz w:val="20"/>
+          <w:szCs w:val="20"/>
+        </w:rPr>
+        <w:t>Led quality and delivery governance across enterprise software programs, supporting SDLC planning and release readiness.</w:t>
+      </w:r>
+    </w:p>
+    <w:p>
+      <w:pPr>
+        <w:spacing w:before="140" w:after="20"/>
+      </w:pPr>
+      <w:r>
+        <w:rPr>
+          <w:rFonts w:ascii="Arial" w:hAnsi="Arial" w:eastAsia="Arial" w:cs="Arial"/>
+          <w:b/>
+          <w:bCs/>
+          <w:color w:val="232323"/>
+          <w:sz w:val="22"/>
+          <w:szCs w:val="22"/>
+        </w:rPr>
+        <w:t xml:space="preserve">Cognizant Technology Solutions – </w:t>
+      </w:r>
+      <w:r>
+        <w:rPr>
+          <w:rFonts w:hint="default" w:ascii="Arial" w:hAnsi="Arial" w:eastAsia="Arial" w:cs="Arial"/>
+          <w:b/>
+          <w:bCs/>
+          <w:color w:val="232323"/>
+          <w:sz w:val="22"/>
+          <w:szCs w:val="22"/>
+          <w:lang w:val="en-US"/>
+        </w:rPr>
+        <w:t>Sr.Associate</w:t>
+      </w:r>
+      <w:r>
+        <w:rPr>
+          <w:rFonts w:ascii="Arial" w:hAnsi="Arial" w:eastAsia="Arial" w:cs="Arial"/>
+          <w:b/>
+          <w:bCs/>
+          <w:color w:val="232323"/>
+          <w:sz w:val="22"/>
+          <w:szCs w:val="22"/>
+        </w:rPr>
+        <w:t>, Projects(QA)  |  Nov 200</w:t>
+      </w:r>
+      <w:r>
+        <w:rPr>
+          <w:rFonts w:hint="default" w:ascii="Arial" w:hAnsi="Arial" w:eastAsia="Arial" w:cs="Arial"/>
+          <w:b/>
+          <w:bCs/>
+          <w:color w:val="232323"/>
+          <w:sz w:val="22"/>
+          <w:szCs w:val="22"/>
+          <w:lang w:val="en-US"/>
+        </w:rPr>
+        <w:t>9</w:t>
       </w:r>
       <w:bookmarkStart w:id="0" w:name="_GoBack"/>
       <w:bookmarkEnd w:id="0"/>
+      <w:r>
+        <w:rPr>
+          <w:rFonts w:ascii="Arial" w:hAnsi="Arial" w:eastAsia="Arial" w:cs="Arial"/>
+          <w:b/>
+          <w:bCs/>
+          <w:color w:val="232323"/>
+          <w:sz w:val="22"/>
+          <w:szCs w:val="22"/>
+        </w:rPr>
+        <w:t xml:space="preserve"> – Apr 2014</w:t>
+      </w:r>
+    </w:p>
+    <w:p>
+      <w:pPr>
+        <w:pStyle w:val="16"/>
+        <w:numPr>
+          <w:ilvl w:val="0"/>
+          <w:numId w:val="1"/>
+        </w:numPr>
+        <w:spacing w:after="40" w:line="250" w:lineRule="auto"/>
+        <w:jc w:val="both"/>
+      </w:pPr>
+      <w:r>
+        <w:rPr>
+          <w:rFonts w:ascii="Arial" w:hAnsi="Arial" w:eastAsia="Arial" w:cs="Arial"/>
+          <w:color w:val="232323"/>
+          <w:sz w:val="20"/>
+          <w:szCs w:val="20"/>
+        </w:rPr>
+        <w:t>Managed project delivery and client engagements across the software development lifecycle, building the foundation in IT project and program management.</w:t>
+      </w:r>
     </w:p>
     <w:sectPr>
       <w:pgSz w:w="11906" w:h="16838"/>
@@ -2596,7 +2691,7 @@
   <w:docDefaults>
     <w:rPrDefault>
       <w:rPr>
-        <w:rFonts w:asciiTheme="minorHAnsi" w:hAnsiTheme="minorHAnsi" w:eastAsiaTheme="minorEastAsia" w:cstheme="minorBidi"/>
+        <w:rFonts w:ascii="Times New Roman" w:hAnsi="Times New Roman" w:eastAsia="SimSun" w:cs="Times New Roman"/>
       </w:rPr>
     </w:rPrDefault>
     <w:pPrDefault/>
@@ -2644,8 +2739,8 @@
     <w:lsdException w:unhideWhenUsed="0" w:uiPriority="0" w:semiHidden="0" w:name="annotation reference"/>
     <w:lsdException w:unhideWhenUsed="0" w:uiPriority="0" w:semiHidden="0" w:name="line number"/>
     <w:lsdException w:unhideWhenUsed="0" w:uiPriority="0" w:semiHidden="0" w:name="page number"/>
-    <w:lsdException w:uiPriority="99" w:name="endnote reference"/>
-    <w:lsdException w:uiPriority="99" w:name="endnote text"/>
+    <w:lsdException w:qFormat="1" w:uiPriority="99" w:name="endnote reference"/>
+    <w:lsdException w:qFormat="1" w:uiPriority="99" w:name="endnote text"/>
     <w:lsdException w:unhideWhenUsed="0" w:uiPriority="0" w:semiHidden="0" w:name="table of authorities"/>
     <w:lsdException w:unhideWhenUsed="0" w:uiPriority="0" w:semiHidden="0" w:name="macro"/>
     <w:lsdException w:unhideWhenUsed="0" w:uiPriority="0" w:semiHidden="0" w:name="toa heading"/>
@@ -2857,6 +2952,7 @@
     <w:qFormat/>
     <w:uiPriority w:val="0"/>
     <w:rPr>
+      <w:rFonts w:asciiTheme="minorHAnsi" w:hAnsiTheme="minorHAnsi" w:eastAsiaTheme="minorEastAsia" w:cstheme="minorBidi"/>
       <w:sz w:val="21"/>
       <w:szCs w:val="22"/>
     </w:rPr>
@@ -2867,6 +2963,7 @@
     <w:qFormat/>
     <w:uiPriority w:val="0"/>
     <w:rPr>
+      <w:rFonts w:asciiTheme="minorHAnsi" w:hAnsiTheme="minorHAnsi" w:eastAsiaTheme="minorEastAsia" w:cstheme="minorBidi"/>
       <w:color w:val="2E74B5"/>
       <w:sz w:val="32"/>
       <w:szCs w:val="32"/>
@@ -2878,6 +2975,7 @@
     <w:qFormat/>
     <w:uiPriority w:val="0"/>
     <w:rPr>
+      <w:rFonts w:asciiTheme="minorHAnsi" w:hAnsiTheme="minorHAnsi" w:eastAsiaTheme="minorEastAsia" w:cstheme="minorBidi"/>
       <w:color w:val="2E74B5"/>
       <w:sz w:val="26"/>
       <w:szCs w:val="26"/>
@@ -2889,6 +2987,7 @@
     <w:qFormat/>
     <w:uiPriority w:val="0"/>
     <w:rPr>
+      <w:rFonts w:asciiTheme="minorHAnsi" w:hAnsiTheme="minorHAnsi" w:eastAsiaTheme="minorEastAsia" w:cstheme="minorBidi"/>
       <w:color w:val="1F4D78"/>
       <w:sz w:val="24"/>
       <w:szCs w:val="24"/>
@@ -2900,6 +2999,7 @@
     <w:qFormat/>
     <w:uiPriority w:val="0"/>
     <w:rPr>
+      <w:rFonts w:asciiTheme="minorHAnsi" w:hAnsiTheme="minorHAnsi" w:eastAsiaTheme="minorEastAsia" w:cstheme="minorBidi"/>
       <w:i/>
       <w:iCs/>
       <w:color w:val="2E74B5"/>
@@ -2913,6 +3013,7 @@
     <w:qFormat/>
     <w:uiPriority w:val="0"/>
     <w:rPr>
+      <w:rFonts w:asciiTheme="minorHAnsi" w:hAnsiTheme="minorHAnsi" w:eastAsiaTheme="minorEastAsia" w:cstheme="minorBidi"/>
       <w:color w:val="2E74B5"/>
       <w:sz w:val="21"/>
       <w:szCs w:val="22"/>
@@ -2924,6 +3025,7 @@
     <w:qFormat/>
     <w:uiPriority w:val="0"/>
     <w:rPr>
+      <w:rFonts w:asciiTheme="minorHAnsi" w:hAnsiTheme="minorHAnsi" w:eastAsiaTheme="minorEastAsia" w:cstheme="minorBidi"/>
       <w:color w:val="1F4D78"/>
       <w:sz w:val="21"/>
       <w:szCs w:val="22"/>
@@ -2953,6 +3055,7 @@
     <w:name w:val="endnote reference"/>
     <w:semiHidden/>
     <w:unhideWhenUsed/>
+    <w:qFormat/>
     <w:uiPriority w:val="99"/>
     <w:rPr>
       <w:vertAlign w:val="superscript"/>
@@ -2963,11 +3066,13 @@
     <w:link w:val="18"/>
     <w:semiHidden/>
     <w:unhideWhenUsed/>
+    <w:qFormat/>
     <w:uiPriority w:val="99"/>
     <w:pPr>
       <w:spacing w:after="0" w:line="240" w:lineRule="auto"/>
     </w:pPr>
     <w:rPr>
+      <w:rFonts w:asciiTheme="minorHAnsi" w:hAnsiTheme="minorHAnsi" w:eastAsiaTheme="minorEastAsia" w:cstheme="minorBidi"/>
       <w:sz w:val="20"/>
       <w:szCs w:val="20"/>
     </w:rPr>
@@ -2993,6 +3098,7 @@
       <w:spacing w:after="0" w:line="240" w:lineRule="auto"/>
     </w:pPr>
     <w:rPr>
+      <w:rFonts w:asciiTheme="minorHAnsi" w:hAnsiTheme="minorHAnsi" w:eastAsiaTheme="minorEastAsia" w:cstheme="minorBidi"/>
       <w:sz w:val="20"/>
       <w:szCs w:val="20"/>
     </w:rPr>
@@ -3012,6 +3118,7 @@
     <w:qFormat/>
     <w:uiPriority w:val="0"/>
     <w:rPr>
+      <w:rFonts w:asciiTheme="minorHAnsi" w:hAnsiTheme="minorHAnsi" w:eastAsiaTheme="minorEastAsia" w:cstheme="minorBidi"/>
       <w:sz w:val="56"/>
       <w:szCs w:val="56"/>
     </w:rPr>
@@ -3021,6 +3128,7 @@
     <w:qFormat/>
     <w:uiPriority w:val="0"/>
     <w:rPr>
+      <w:rFonts w:asciiTheme="minorHAnsi" w:hAnsiTheme="minorHAnsi" w:eastAsiaTheme="minorEastAsia" w:cstheme="minorBidi"/>
       <w:sz w:val="21"/>
       <w:szCs w:val="22"/>
     </w:rPr>
@@ -3042,6 +3150,7 @@
     <w:link w:val="11"/>
     <w:semiHidden/>
     <w:unhideWhenUsed/>
+    <w:qFormat/>
     <w:uiPriority w:val="99"/>
     <w:rPr>
       <w:sz w:val="20"/>

</xml_diff>